<commit_message>
Final: official-SWaT drift study, paper and Word manuscript updated
- results/revised/drift_official.json (official SWaT, 25 sensors)
- paper drift section/table/figure on official data; GitHub link in Data Availability
- logs and change log updated

Co-Authored-By: Claude Opus 5.5 <noreply@anthropic.com>
</commit_message>
<xml_diff>
--- a/paper/current/Shah_IJPHM_Protocol_Sensitivity_Industrial_Anomaly_Detection.docx
+++ b/paper/current/Shah_IJPHM_Protocol_Sensitivity_Industrial_Anomaly_Detection.docx
@@ -245,7 +245,7 @@
         <w:t xml:space="preserve"> </w:t>
       </w:r>
       <w:r>
-        <w:t xml:space="preserve">Forest’s false-alarm rate from 12% to 76%; retraining restored detection only when</w:t>
+        <w:t xml:space="preserve">Forest’s false-alarm rate from 10% to 86%; retraining restored detection only when</w:t>
       </w:r>
       <w:r>
         <w:t xml:space="preserve"> </w:t>
@@ -4719,6 +4719,14 @@
         <w:t xml:space="preserve">Drift and Retraining</w:t>
       </w:r>
     </w:p>
+    <w:p>
+      <w:pPr>
+        <w:pStyle w:val="phmbodytext"/>
+      </w:pPr>
+      <w:r>
+        <w:t xml:space="preserve">The retraining study uses the official SWaT release with all 25 sensors.</w:t>
+      </w:r>
+    </w:p>
     <w:bookmarkStart w:id="59" w:name="does-normal-operation-drift"/>
     <w:p>
       <w:pPr>
@@ -4733,37 +4741,31 @@
         <w:pStyle w:val="phmbodytext"/>
       </w:pPr>
       <w:r>
-        <w:t xml:space="preserve">Streaming SWaT’s genuine normal week</w:t>
-      </w:r>
-      <w:r>
-        <w:t xml:space="preserve"> </w:t>
-      </w:r>
-      <w:r>
-        <w:t xml:space="preserve">through a static Isolation Forest fitted on its first 14 hours, the share of</w:t>
-      </w:r>
-      <w:r>
-        <w:t xml:space="preserve"> </w:t>
-      </w:r>
-      <w:r>
-        <w:t xml:space="preserve">normal readings that raise an alarm, after a transient spike in the first day,</w:t>
-      </w:r>
-      <w:r>
-        <w:t xml:space="preserve"> </w:t>
-      </w:r>
-      <w:r>
-        <w:t xml:space="preserve">stays near the design rate of 1% for about two days and then jumps, at roughly</w:t>
-      </w:r>
-      <w:r>
-        <w:t xml:space="preserve"> </w:t>
-      </w:r>
-      <w:r>
-        <w:t xml:space="preserve">hour 48, to 40–94% for the rest of the week (mean 12% over the first 24</w:t>
-      </w:r>
-      <w:r>
-        <w:t xml:space="preserve"> </w:t>
-      </w:r>
-      <w:r>
-        <w:t xml:space="preserve">streamed hours, 76% over the last 24; Fig. </w:t>
+        <w:t xml:space="preserve">Streaming SWaT’s normal week through a static</w:t>
+      </w:r>
+      <w:r>
+        <w:t xml:space="preserve"> </w:t>
+      </w:r>
+      <w:r>
+        <w:t xml:space="preserve">Isolation Forest fitted on its first 14 hours, the share of normal readings that raise an</w:t>
+      </w:r>
+      <w:r>
+        <w:t xml:space="preserve"> </w:t>
+      </w:r>
+      <w:r>
+        <w:t xml:space="preserve">alarm shows two transient spikes in the first 30 hours (up to 45%), stays near the design</w:t>
+      </w:r>
+      <w:r>
+        <w:t xml:space="preserve"> </w:t>
+      </w:r>
+      <w:r>
+        <w:t xml:space="preserve">rate of 1% until about hour 48, and then jumps to 33–100% for the rest of the week (mean</w:t>
+      </w:r>
+      <w:r>
+        <w:t xml:space="preserve"> </w:t>
+      </w:r>
+      <w:r>
+        <w:t xml:space="preserve">10% over the first 24 streamed hours, 86% over the last 24; Fig. </w:t>
       </w:r>
       <w:hyperlink w:anchor="fig:drift">
         <w:r>
@@ -4774,49 +4776,49 @@
         </w:r>
       </w:hyperlink>
       <w:r>
-        <w:t xml:space="preserve">, left). The change</w:t>
-      </w:r>
-      <w:r>
-        <w:t xml:space="preserve"> </w:t>
-      </w:r>
-      <w:r>
-        <w:t xml:space="preserve">is a step, consistent with a change in operating regime, rather than a slow trend. The</w:t>
-      </w:r>
-      <w:r>
-        <w:t xml:space="preserve"> </w:t>
-      </w:r>
-      <w:r>
-        <w:t xml:space="preserve">Elliptic Envelope fitted on the same window does not show this: its false-alarm</w:t>
-      </w:r>
-      <w:r>
-        <w:t xml:space="preserve"> </w:t>
-      </w:r>
-      <w:r>
-        <w:t xml:space="preserve">rate over the normal week is 0.9%. Drift is therefore real, but whether it</w:t>
-      </w:r>
-      <w:r>
-        <w:t xml:space="preserve"> </w:t>
-      </w:r>
-      <w:r>
-        <w:t xml:space="preserve">matters depends on the detector. Isolation Forest operates on all 120 raw-scale</w:t>
-      </w:r>
-      <w:r>
-        <w:t xml:space="preserve"> </w:t>
-      </w:r>
-      <w:r>
-        <w:t xml:space="preserve">features, whereas the Elliptic Envelope operates on ten whitened principal</w:t>
-      </w:r>
-      <w:r>
-        <w:t xml:space="preserve"> </w:t>
-      </w:r>
-      <w:r>
-        <w:t xml:space="preserve">components; a plausible, untested explanation is that slow level changes in</w:t>
-      </w:r>
-      <w:r>
-        <w:t xml:space="preserve"> </w:t>
-      </w:r>
-      <w:r>
-        <w:t xml:space="preserve">individual sensors fall mostly outside those components.</w:t>
+        <w:t xml:space="preserve">,</w:t>
+      </w:r>
+      <w:r>
+        <w:t xml:space="preserve"> </w:t>
+      </w:r>
+      <w:r>
+        <w:t xml:space="preserve">left). The change is a step, consistent with a change in operating regime, rather than a</w:t>
+      </w:r>
+      <w:r>
+        <w:t xml:space="preserve"> </w:t>
+      </w:r>
+      <w:r>
+        <w:t xml:space="preserve">slow trend. The Elliptic Envelope fitted on the same window does not show this: its</w:t>
+      </w:r>
+      <w:r>
+        <w:t xml:space="preserve"> </w:t>
+      </w:r>
+      <w:r>
+        <w:t xml:space="preserve">false-alarm rate over the normal week is 0.9%. Drift is therefore real, but whether it</w:t>
+      </w:r>
+      <w:r>
+        <w:t xml:space="preserve"> </w:t>
+      </w:r>
+      <w:r>
+        <w:t xml:space="preserve">matters depends on the detector. Isolation Forest operates on all 125 features, whereas the</w:t>
+      </w:r>
+      <w:r>
+        <w:t xml:space="preserve"> </w:t>
+      </w:r>
+      <w:r>
+        <w:t xml:space="preserve">Elliptic Envelope operates on ten whitened principal components; a plausible, untested</w:t>
+      </w:r>
+      <w:r>
+        <w:t xml:space="preserve"> </w:t>
+      </w:r>
+      <w:r>
+        <w:t xml:space="preserve">explanation is that the level changes of individual sensors fall mostly outside those</w:t>
+      </w:r>
+      <w:r>
+        <w:t xml:space="preserve"> </w:t>
+      </w:r>
+      <w:r>
+        <w:t xml:space="preserve">components.</w:t>
       </w:r>
     </w:p>
     <w:bookmarkEnd w:id="59"/>
@@ -4850,13 +4852,13 @@
         <w:t xml:space="preserve"> </w:t>
       </w:r>
       <w:r>
-        <w:t xml:space="preserve">is a batch on which the</w:t>
-      </w:r>
-      <w:r>
-        <w:t xml:space="preserve"> </w:t>
-      </w:r>
-      <w:r>
-        <w:t xml:space="preserve">policy fires; it becomes a</w:t>
+        <w:t xml:space="preserve">is a batch on which the policy</w:t>
+      </w:r>
+      <w:r>
+        <w:t xml:space="preserve"> </w:t>
+      </w:r>
+      <w:r>
+        <w:t xml:space="preserve">fires; it becomes a</w:t>
       </w:r>
       <w:r>
         <w:t xml:space="preserve"> </w:t>
@@ -4872,25 +4874,25 @@
         <w:t xml:space="preserve"> </w:t>
       </w:r>
       <w:r>
-        <w:t xml:space="preserve">only if the selected five-hour window holds</w:t>
-      </w:r>
-      <w:r>
-        <w:t xml:space="preserve"> </w:t>
-      </w:r>
-      <w:r>
-        <w:t xml:space="preserve">more than 1</w:t>
+        <w:t xml:space="preserve">only if the selected five-hour window holds more than</w:t>
+      </w:r>
+      <w:r>
+        <w:t xml:space="preserve"> </w:t>
+      </w:r>
+      <w:r>
+        <w:t xml:space="preserve">1</w:t>
       </w:r>
       <w:r>
         <w:t xml:space="preserve">,</w:t>
       </w:r>
       <w:r>
-        <w:t xml:space="preserve">000 rows, otherwise the current model is kept. To compare policies at</w:t>
-      </w:r>
-      <w:r>
-        <w:t xml:space="preserve"> </w:t>
-      </w:r>
-      <w:r>
-        <w:t xml:space="preserve">equal cost, the periodic policy was run every</w:t>
+        <w:t xml:space="preserve">000 rows, otherwise the current model is kept. To compare policies at equal cost, the</w:t>
+      </w:r>
+      <w:r>
+        <w:t xml:space="preserve"> </w:t>
+      </w:r>
+      <w:r>
+        <w:t xml:space="preserve">periodic policy was run every</w:t>
       </w:r>
       <w:r>
         <w:t xml:space="preserve"> </w:t>
@@ -4988,19 +4990,19 @@
         <w:t xml:space="preserve"> </w:t>
       </w:r>
       <w:r>
-        <w:t xml:space="preserve">batches,</w:t>
-      </w:r>
-      <w:r>
-        <w:t xml:space="preserve"> </w:t>
-      </w:r>
-      <w:r>
-        <w:t xml:space="preserve">which traces how detection skill grows with the number of refits; the KS-triggered</w:t>
-      </w:r>
-      <w:r>
-        <w:t xml:space="preserve"> </w:t>
-      </w:r>
-      <w:r>
-        <w:t xml:space="preserve">policy is then read against that curve (Table </w:t>
+        <w:t xml:space="preserve">batches, which traces how</w:t>
+      </w:r>
+      <w:r>
+        <w:t xml:space="preserve"> </w:t>
+      </w:r>
+      <w:r>
+        <w:t xml:space="preserve">detection skill grows with the number of refits; the KS-triggered policy is then read</w:t>
+      </w:r>
+      <w:r>
+        <w:t xml:space="preserve"> </w:t>
+      </w:r>
+      <w:r>
+        <w:t xml:space="preserve">against that curve (Table </w:t>
       </w:r>
       <w:hyperlink w:anchor="tab:drift">
         <w:r>
@@ -5046,55 +5048,49 @@
         <w:t xml:space="preserve"> </w:t>
       </w:r>
       <w:r>
-        <w:t xml:space="preserve">ground-truth labels (as in the initial analysis), Isolation Forest’s skill over the</w:t>
-      </w:r>
-      <w:r>
-        <w:t xml:space="preserve"> </w:t>
-      </w:r>
-      <w:r>
-        <w:t xml:space="preserve">attack period rises steadily with the number of refits: MCC 0.167 static (73% of</w:t>
-      </w:r>
-      <w:r>
-        <w:t xml:space="preserve"> </w:t>
-      </w:r>
-      <w:r>
-        <w:t xml:space="preserve">normal rows flagged), 0.276 with 5 refits, 0.380 with 40, 0.456 with 80, 0.485</w:t>
-      </w:r>
-      <w:r>
-        <w:t xml:space="preserve"> </w:t>
-      </w:r>
-      <w:r>
-        <w:t xml:space="preserve">with 120 and 0.537 when refitting after every batch (239). The KS-triggered policy</w:t>
-      </w:r>
-      <w:r>
-        <w:t xml:space="preserve"> </w:t>
-      </w:r>
-      <w:r>
-        <w:t xml:space="preserve">reached 0.488 with 74 refits (79 attempts), above the periodic curve at 80 refits</w:t>
-      </w:r>
-      <w:r>
-        <w:t xml:space="preserve"> </w:t>
-      </w:r>
-      <w:r>
-        <w:t xml:space="preserve">and level with periodic retraining at 120 refits, so triggering buys a modest saving in</w:t>
-      </w:r>
-      <w:r>
-        <w:t xml:space="preserve"> </w:t>
-      </w:r>
-      <w:r>
-        <w:t xml:space="preserve">the number of refits. For the Elliptic Envelope, no budget changes the outcome: MCC</w:t>
-      </w:r>
-      <w:r>
-        <w:t xml:space="preserve"> </w:t>
-      </w:r>
-      <w:r>
-        <w:t xml:space="preserve">0.707–0.731 at every periodic budget and 0.709 for the KS policy, against 0.723</w:t>
-      </w:r>
-      <w:r>
-        <w:t xml:space="preserve"> </w:t>
-      </w:r>
-      <w:r>
-        <w:t xml:space="preserve">for the static model.</w:t>
+        <w:t xml:space="preserve">ground-truth labels (as in the initial analysis), Isolation Forest’s skill over the attack</w:t>
+      </w:r>
+      <w:r>
+        <w:t xml:space="preserve"> </w:t>
+      </w:r>
+      <w:r>
+        <w:t xml:space="preserve">period rises steadily with the number of refits: MCC 0.165 static (75% of the attack</w:t>
+      </w:r>
+      <w:r>
+        <w:t xml:space="preserve"> </w:t>
+      </w:r>
+      <w:r>
+        <w:t xml:space="preserve">period’s normal rows flagged), 0.288 with 5 refits, 0.404 with 40, 0.478 with 80,</w:t>
+      </w:r>
+      <w:r>
+        <w:t xml:space="preserve"> </w:t>
+      </w:r>
+      <w:r>
+        <w:t xml:space="preserve">0.502 with 120 and 0.567 when refitting after every batch (239). The KS-triggered policy</w:t>
+      </w:r>
+      <w:r>
+        <w:t xml:space="preserve"> </w:t>
+      </w:r>
+      <w:r>
+        <w:t xml:space="preserve">reached 0.549 with 89 refits (94 attempts), well above the periodic curve at that budget</w:t>
+      </w:r>
+      <w:r>
+        <w:t xml:space="preserve"> </w:t>
+      </w:r>
+      <w:r>
+        <w:t xml:space="preserve">and close to refitting after every batch, so triggering does save refits. For the Elliptic</w:t>
+      </w:r>
+      <w:r>
+        <w:t xml:space="preserve"> </w:t>
+      </w:r>
+      <w:r>
+        <w:t xml:space="preserve">Envelope, no budget changes the outcome: MCC 0.705–0.732 at every periodic budget and</w:t>
+      </w:r>
+      <w:r>
+        <w:t xml:space="preserve"> </w:t>
+      </w:r>
+      <w:r>
+        <w:t xml:space="preserve">0.709 for the KS policy, against 0.724 for the static model.</w:t>
       </w:r>
     </w:p>
     <w:bookmarkEnd w:id="61"/>
@@ -5112,13 +5108,13 @@
         <w:pStyle w:val="phmbodytext"/>
       </w:pPr>
       <w:r>
-        <w:t xml:space="preserve">A deployed detector does not know</w:t>
-      </w:r>
-      <w:r>
-        <w:t xml:space="preserve"> </w:t>
-      </w:r>
-      <w:r>
-        <w:t xml:space="preserve">which recent rows are normal. When Isolation Forest retrains on the rows it did</w:t>
+        <w:t xml:space="preserve">A deployed detector does not know which</w:t>
+      </w:r>
+      <w:r>
+        <w:t xml:space="preserve"> </w:t>
+      </w:r>
+      <w:r>
+        <w:t xml:space="preserve">recent rows are normal. When Isolation Forest retrains on the rows it did</w:t>
       </w:r>
       <w:r>
         <w:t xml:space="preserve"> </w:t>
@@ -5134,113 +5130,73 @@
         <w:t xml:space="preserve"> </w:t>
       </w:r>
       <w:r>
-        <w:t xml:space="preserve">flag, it enters a self-reinforcing failure: once it flags most rows, too few</w:t>
-      </w:r>
-      <w:r>
-        <w:t xml:space="preserve"> </w:t>
-      </w:r>
-      <w:r>
-        <w:t xml:space="preserve">remain to refit on, attempts stop turning into refits (193 attempts gave 52 refits</w:t>
-      </w:r>
-      <w:r>
-        <w:t xml:space="preserve"> </w:t>
-      </w:r>
-      <w:r>
-        <w:t xml:space="preserve">under the KS policy; 61 attempts gave 10 refits at</w:t>
-      </w:r>
-      <w:r>
-        <w:t xml:space="preserve"> </w:t>
-      </w:r>
-      <m:oMath>
-        <m:r>
-          <m:t>P</m:t>
-        </m:r>
-        <m:r>
-          <m:rPr>
-            <m:sty m:val="p"/>
-          </m:rPr>
-          <m:t>=</m:t>
-        </m:r>
-        <m:r>
-          <m:t>4</m:t>
-        </m:r>
-      </m:oMath>
-      <w:r>
-        <w:t xml:space="preserve">), and the detector ends up</w:t>
-      </w:r>
-      <w:r>
-        <w:t xml:space="preserve"> </w:t>
-      </w:r>
-      <w:r>
-        <w:t xml:space="preserve">flagging everything (MCC 0.000–0.033 at every budget except</w:t>
-      </w:r>
-      <w:r>
-        <w:t xml:space="preserve"> </w:t>
-      </w:r>
-      <m:oMath>
-        <m:r>
-          <m:t>P</m:t>
-        </m:r>
-        <m:r>
-          <m:rPr>
-            <m:sty m:val="p"/>
-          </m:rPr>
-          <m:t>=</m:t>
-        </m:r>
-        <m:r>
-          <m:t>2</m:t>
-        </m:r>
-      </m:oMath>
-      <w:r>
-        <w:t xml:space="preserve">, 0.286).</w:t>
-      </w:r>
-      <w:r>
-        <w:t xml:space="preserve"> </w:t>
-      </w:r>
-      <w:r>
-        <w:t xml:space="preserve">Retraining on all recent rows avoids that collapse but absorbs the attacks into the</w:t>
-      </w:r>
-      <w:r>
-        <w:t xml:space="preserve"> </w:t>
-      </w:r>
-      <w:r>
-        <w:t xml:space="preserve">model of normal behaviour: recall falls to 0.27–0.51 and MCC to 0.074–0.303</w:t>
-      </w:r>
-      <w:r>
-        <w:t xml:space="preserve"> </w:t>
-      </w:r>
-      <w:r>
-        <w:t xml:space="preserve">whenever refits are frequent. The Elliptic Envelope tolerates predicted-normal selection</w:t>
-      </w:r>
-      <w:r>
-        <w:t xml:space="preserve"> </w:t>
-      </w:r>
-      <w:r>
-        <w:t xml:space="preserve">at every budget (MCC 0.683–0.748). With all-rows retraining it loses skill only when</w:t>
-      </w:r>
-      <w:r>
-        <w:t xml:space="preserve"> </w:t>
-      </w:r>
-      <w:r>
-        <w:t xml:space="preserve">refits are frequent (MCC 0.332–0.530 with 40 or more refits, 0.683–0.717 with</w:t>
-      </w:r>
-      <w:r>
-        <w:t xml:space="preserve"> </w:t>
-      </w:r>
-      <w:r>
-        <w:t xml:space="preserve">20 or fewer), because each frequent refit takes in a larger share of the ongoing attacks.</w:t>
-      </w:r>
-      <w:r>
-        <w:t xml:space="preserve"> </w:t>
-      </w:r>
-      <w:r>
-        <w:t xml:space="preserve">The benefit of adaptation reported in the initial analysis therefore depended on labels</w:t>
-      </w:r>
-      <w:r>
-        <w:t xml:space="preserve"> </w:t>
-      </w:r>
-      <w:r>
-        <w:t xml:space="preserve">that a deployment would not have.</w:t>
+        <w:t xml:space="preserve">flag,</w:t>
+      </w:r>
+      <w:r>
+        <w:t xml:space="preserve"> </w:t>
+      </w:r>
+      <w:r>
+        <w:t xml:space="preserve">it enters a self-reinforcing failure: once it flags most rows, too few remain to refit on,</w:t>
+      </w:r>
+      <w:r>
+        <w:t xml:space="preserve"> </w:t>
+      </w:r>
+      <w:r>
+        <w:t xml:space="preserve">attempts stop turning into refits (224 attempts gave 24 refits under the KS policy), and the</w:t>
+      </w:r>
+      <w:r>
+        <w:t xml:space="preserve"> </w:t>
+      </w:r>
+      <w:r>
+        <w:t xml:space="preserve">detector ends up flagging everything (MCC 0.000–0.069 at every budget). Retraining on</w:t>
+      </w:r>
+      <w:r>
+        <w:t xml:space="preserve"> </w:t>
+      </w:r>
+      <w:r>
+        <w:t xml:space="preserve">all recent rows avoids that collapse but absorbs the attacks into the model of normal</w:t>
+      </w:r>
+      <w:r>
+        <w:t xml:space="preserve"> </w:t>
+      </w:r>
+      <w:r>
+        <w:t xml:space="preserve">behaviour: recall falls to 0.27–0.45 and MCC to 0.084–0.255 whenever refits are</w:t>
+      </w:r>
+      <w:r>
+        <w:t xml:space="preserve"> </w:t>
+      </w:r>
+      <w:r>
+        <w:t xml:space="preserve">frequent (40 or more). The Elliptic Envelope tolerates predicted-normal selection at every</w:t>
+      </w:r>
+      <w:r>
+        <w:t xml:space="preserve"> </w:t>
+      </w:r>
+      <w:r>
+        <w:t xml:space="preserve">budget (MCC 0.703–0.749). With all-rows retraining it loses skill only when refits are</w:t>
+      </w:r>
+      <w:r>
+        <w:t xml:space="preserve"> </w:t>
+      </w:r>
+      <w:r>
+        <w:t xml:space="preserve">frequent (MCC 0.329–0.530 with 40 or more refits, 0.678–0.718 with 20 or fewer),</w:t>
+      </w:r>
+      <w:r>
+        <w:t xml:space="preserve"> </w:t>
+      </w:r>
+      <w:r>
+        <w:t xml:space="preserve">because each frequent refit takes in a larger share of the ongoing attacks. The benefit of</w:t>
+      </w:r>
+      <w:r>
+        <w:t xml:space="preserve"> </w:t>
+      </w:r>
+      <w:r>
+        <w:t xml:space="preserve">adaptation reported in the initial analysis therefore depended on labels that a deployment</w:t>
+      </w:r>
+      <w:r>
+        <w:t xml:space="preserve"> </w:t>
+      </w:r>
+      <w:r>
+        <w:t xml:space="preserve">would not have.</w:t>
       </w:r>
     </w:p>
     <w:bookmarkEnd w:id="62"/>
@@ -5258,61 +5214,61 @@
         <w:pStyle w:val="phmbodytext"/>
       </w:pPr>
       <w:r>
-        <w:t xml:space="preserve">On the host, an Isolation Forest refit on five hours of data took</w:t>
-      </w:r>
-      <w:r>
-        <w:t xml:space="preserve"> </w:t>
-      </w:r>
-      <w:r>
-        <w:t xml:space="preserve">about 0.08 s and an Elliptic Envelope refit about 1.1 s. The KS check (120</w:t>
-      </w:r>
-      <w:r>
-        <w:t xml:space="preserve"> </w:t>
-      </w:r>
-      <w:r>
-        <w:t xml:space="preserve">features against a reference of up to 50</w:t>
+        <w:t xml:space="preserve">On the host, an Isolation Forest refit on five hours of data took about</w:t>
+      </w:r>
+      <w:r>
+        <w:t xml:space="preserve"> </w:t>
+      </w:r>
+      <w:r>
+        <w:t xml:space="preserve">0.07 s and an Elliptic Envelope refit about 0.9 s. The KS check (125 features against</w:t>
+      </w:r>
+      <w:r>
+        <w:t xml:space="preserve"> </w:t>
+      </w:r>
+      <w:r>
+        <w:t xml:space="preserve">a reference of up to 50</w:t>
       </w:r>
       <w:r>
         <w:t xml:space="preserve">,</w:t>
       </w:r>
       <w:r>
-        <w:t xml:space="preserve">000 rows) cost 51–117 s of CPU over the</w:t>
-      </w:r>
-      <w:r>
-        <w:t xml:space="preserve"> </w:t>
-      </w:r>
-      <w:r>
-        <w:t xml:space="preserve">244 batches in the label-selected and all-rows runs (0.2–0.5 s per batch) and</w:t>
-      </w:r>
-      <w:r>
-        <w:t xml:space="preserve"> </w:t>
-      </w:r>
-      <w:r>
-        <w:t xml:space="preserve">483 s in the collapsing predicted-normal run. For Isolation Forest the checks alone</w:t>
-      </w:r>
-      <w:r>
-        <w:t xml:space="preserve"> </w:t>
-      </w:r>
-      <w:r>
-        <w:t xml:space="preserve">cost five times more than refitting after every batch (96 s against 19 s, oracle</w:t>
-      </w:r>
-      <w:r>
-        <w:t xml:space="preserve"> </w:t>
-      </w:r>
-      <w:r>
-        <w:t xml:space="preserve">selection), and every-batch refitting gave the best detection, so a drift trigger does not</w:t>
-      </w:r>
-      <w:r>
-        <w:t xml:space="preserve"> </w:t>
-      </w:r>
-      <w:r>
-        <w:t xml:space="preserve">pay. A trigger can pay only when refits are expensive relative to the check, as for the</w:t>
-      </w:r>
-      <w:r>
-        <w:t xml:space="preserve"> </w:t>
-      </w:r>
-      <w:r>
-        <w:t xml:space="preserve">Elliptic Envelope, which in this stream did not need retraining at all.</w:t>
+        <w:t xml:space="preserve">000 rows) cost 53–98 s of CPU over the 244 batches in the</w:t>
+      </w:r>
+      <w:r>
+        <w:t xml:space="preserve"> </w:t>
+      </w:r>
+      <w:r>
+        <w:t xml:space="preserve">label-selected and all-rows runs (0.2–0.4 s per batch) and 386 s in the collapsing</w:t>
+      </w:r>
+      <w:r>
+        <w:t xml:space="preserve"> </w:t>
+      </w:r>
+      <w:r>
+        <w:t xml:space="preserve">predicted-normal run. For Isolation Forest the checks alone cost more than five times as much</w:t>
+      </w:r>
+      <w:r>
+        <w:t xml:space="preserve"> </w:t>
+      </w:r>
+      <w:r>
+        <w:t xml:space="preserve">as refitting after every batch (98 s against 18 s, oracle selection), and every-batch</w:t>
+      </w:r>
+      <w:r>
+        <w:t xml:space="preserve"> </w:t>
+      </w:r>
+      <w:r>
+        <w:t xml:space="preserve">refitting gave the best detection, so the refits a trigger saves do not pay for the check. A</w:t>
+      </w:r>
+      <w:r>
+        <w:t xml:space="preserve"> </w:t>
+      </w:r>
+      <w:r>
+        <w:t xml:space="preserve">trigger can pay only when refits are expensive relative to the check, as for the Elliptic</w:t>
+      </w:r>
+      <w:r>
+        <w:t xml:space="preserve"> </w:t>
+      </w:r>
+      <w:r>
+        <w:t xml:space="preserve">Envelope, which in this stream did not need retraining at all.</w:t>
       </w:r>
     </w:p>
     <w:bookmarkEnd w:id="63"/>
@@ -5330,19 +5286,19 @@
         <w:pStyle w:val="phmbodytext"/>
       </w:pPr>
       <w:r>
-        <w:t xml:space="preserve">In this streaming</w:t>
-      </w:r>
-      <w:r>
-        <w:t xml:space="preserve"> </w:t>
-      </w:r>
-      <w:r>
-        <w:t xml:space="preserve">setting the static Elliptic Envelope, fitted on 14 hours, reaches MCC 0.723,</w:t>
-      </w:r>
-      <w:r>
-        <w:t xml:space="preserve"> </w:t>
-      </w:r>
-      <w:r>
-        <w:t xml:space="preserve">yet in Table </w:t>
+        <w:t xml:space="preserve">In this streaming setting the</w:t>
+      </w:r>
+      <w:r>
+        <w:t xml:space="preserve"> </w:t>
+      </w:r>
+      <w:r>
+        <w:t xml:space="preserve">static Elliptic Envelope, fitted on 14 hours, reaches MCC 0.724, yet in</w:t>
+      </w:r>
+      <w:r>
+        <w:t xml:space="preserve"> </w:t>
+      </w:r>
+      <w:r>
+        <w:t xml:space="preserve">Table </w:t>
       </w:r>
       <w:hyperlink w:anchor="tab:swat">
         <w:r>
@@ -5353,43 +5309,37 @@
         </w:r>
       </w:hyperlink>
       <w:r>
-        <w:t xml:space="preserve">, fitted on the full normal week with its threshold</w:t>
-      </w:r>
-      <w:r>
-        <w:t xml:space="preserve"> </w:t>
-      </w:r>
-      <w:r>
-        <w:t xml:space="preserve">set on the week’s last 15%, its label-free MCC is 0.008. The two runs differ</w:t>
-      </w:r>
-      <w:r>
-        <w:t xml:space="preserve"> </w:t>
-      </w:r>
-      <w:r>
-        <w:t xml:space="preserve">only in the training window and threshold-calibration data. One consistent reading</w:t>
-      </w:r>
-      <w:r>
-        <w:t xml:space="preserve"> </w:t>
-      </w:r>
-      <w:r>
-        <w:t xml:space="preserve">is that drift within the normal week inflates the end-of-week scores used for</w:t>
-      </w:r>
-      <w:r>
-        <w:t xml:space="preserve"> </w:t>
-      </w:r>
-      <w:r>
-        <w:t xml:space="preserve">calibration, producing a threshold too high to fire. Either way, a detector</w:t>
-      </w:r>
-      <w:r>
-        <w:t xml:space="preserve"> </w:t>
-      </w:r>
-      <w:r>
-        <w:t xml:space="preserve">whose performance swings this much with the calibration window is fragile in</w:t>
-      </w:r>
-      <w:r>
-        <w:t xml:space="preserve"> </w:t>
-      </w:r>
-      <w:r>
-        <w:t xml:space="preserve">deployment, a property a single benchmark number hides.</w:t>
+        <w:t xml:space="preserve">, fitted on the full normal week with its threshold set on the week’s</w:t>
+      </w:r>
+      <w:r>
+        <w:t xml:space="preserve"> </w:t>
+      </w:r>
+      <w:r>
+        <w:t xml:space="preserve">last 15%, its label-free MCC is 0.005. The two runs differ only in the training window and</w:t>
+      </w:r>
+      <w:r>
+        <w:t xml:space="preserve"> </w:t>
+      </w:r>
+      <w:r>
+        <w:t xml:space="preserve">threshold-calibration data. One consistent reading is that drift within the normal week</w:t>
+      </w:r>
+      <w:r>
+        <w:t xml:space="preserve"> </w:t>
+      </w:r>
+      <w:r>
+        <w:t xml:space="preserve">inflates the end-of-week scores used for calibration, producing a threshold too high to fire.</w:t>
+      </w:r>
+      <w:r>
+        <w:t xml:space="preserve"> </w:t>
+      </w:r>
+      <w:r>
+        <w:t xml:space="preserve">Either way, a detector whose performance swings this much with the calibration window is</w:t>
+      </w:r>
+      <w:r>
+        <w:t xml:space="preserve"> </w:t>
+      </w:r>
+      <w:r>
+        <w:t xml:space="preserve">fragile in deployment, a property a single benchmark number hides.</w:t>
       </w:r>
     </w:p>
     <w:bookmarkEnd w:id="64"/>
@@ -6511,7 +6461,7 @@
       </w:r>
     </w:p>
     <w:bookmarkEnd w:id="73"/>
-    <w:bookmarkStart w:id="74" w:name="data-and-code-availability"/>
+    <w:bookmarkStart w:id="75" w:name="data-and-code-availability"/>
     <w:p>
       <w:pPr>
         <w:pStyle w:val="phmheadingnonumber"/>
@@ -6525,13 +6475,27 @@
         <w:pStyle w:val="phmbodytext"/>
       </w:pPr>
       <w:r>
-        <w:t xml:space="preserve">Code, configuration and all result files are available in the project repository</w:t>
-      </w:r>
-      <w:r>
-        <w:t xml:space="preserve"> </w:t>
-      </w:r>
-      <w:r>
-        <w:t xml:space="preserve">(</w:t>
+        <w:t xml:space="preserve">Code, configuration and all result files are available at</w:t>
+      </w:r>
+      <w:r>
+        <w:t xml:space="preserve"> </w:t>
+      </w:r>
+      <w:hyperlink r:id="rId74">
+        <w:r>
+          <w:rPr>
+            <w:rStyle w:val="Hyperlink"/>
+          </w:rPr>
+          <w:t xml:space="preserve">https://github.com/sarjanshah14/SensorGuard-Research</w:t>
+        </w:r>
+      </w:hyperlink>
+      <w:r>
+        <w:t xml:space="preserve"> </w:t>
+      </w:r>
+      <w:r>
+        <w:t xml:space="preserve">(experiments in</w:t>
+      </w:r>
+      <w:r>
+        <w:t xml:space="preserve"> </w:t>
       </w:r>
       <w:r>
         <w:rPr>
@@ -6540,7 +6504,7 @@
         <w:t xml:space="preserve">experiments/revision/</w:t>
       </w:r>
       <w:r>
-        <w:t xml:space="preserve">,</w:t>
+        <w:t xml:space="preserve">, results in</w:t>
       </w:r>
       <w:r>
         <w:t xml:space="preserve"> </w:t>
@@ -6573,8 +6537,8 @@
         <w:t xml:space="preserve">scikit-learn (Pedregosa et al., 2011), PyOD (Zhao et al., 2019) and PyTorch.</w:t>
       </w:r>
     </w:p>
-    <w:bookmarkEnd w:id="74"/>
-    <w:bookmarkStart w:id="75" w:name="disclosure-of-interests"/>
+    <w:bookmarkEnd w:id="75"/>
+    <w:bookmarkStart w:id="76" w:name="disclosure-of-interests"/>
     <w:p>
       <w:pPr>
         <w:pStyle w:val="phmheadingnonumber"/>
@@ -6591,8 +6555,8 @@
         <w:t xml:space="preserve">The authors have no competing interests to declare.</w:t>
       </w:r>
     </w:p>
-    <w:bookmarkEnd w:id="75"/>
-    <w:bookmarkStart w:id="101" w:name="references"/>
+    <w:bookmarkEnd w:id="76"/>
+    <w:bookmarkStart w:id="102" w:name="references"/>
     <w:p>
       <w:pPr>
         <w:pStyle w:val="phmheadingnonumber"/>
@@ -7573,7 +7537,7 @@
         </w:sectPr>
       </w:pPr>
     </w:p>
-    <w:bookmarkStart w:id="76" w:name="tab:impl"/>
+    <w:bookmarkStart w:id="77" w:name="tab:impl"/>
     <w:tbl>
       <w:tblPr>
         <w:tblStyle w:val="Table"/>
@@ -8155,8 +8119,8 @@
         <w:t xml:space="preserve">that higher means more anomalous.</w:t>
       </w:r>
     </w:p>
-    <w:bookmarkEnd w:id="76"/>
-    <w:bookmarkStart w:id="77" w:name="tab:skab"/>
+    <w:bookmarkEnd w:id="77"/>
+    <w:bookmarkStart w:id="78" w:name="tab:skab"/>
     <w:tbl>
       <w:tblPr>
         <w:tblStyle w:val="Table"/>
@@ -9118,8 +9082,8 @@
         <w:t xml:space="preserve">uses VM; 33 fault events.</w:t>
       </w:r>
     </w:p>
-    <w:bookmarkEnd w:id="77"/>
-    <w:bookmarkStart w:id="81" w:name="fig:auroc"/>
+    <w:bookmarkEnd w:id="78"/>
+    <w:bookmarkStart w:id="82" w:name="fig:auroc"/>
     <w:p>
       <w:pPr>
         <w:pStyle w:val="phmfigures"/>
@@ -9127,20 +9091,20 @@
       <w:r>
         <w:drawing>
           <wp:inline>
-            <wp:extent cx="6400800" cy="1845564"/>
+            <wp:extent cx="6400800" cy="4405884"/>
             <wp:effectExtent b="0" l="0" r="0" t="0"/>
-            <wp:docPr descr="" title="" id="79" name="Picture"/>
+            <wp:docPr descr="" title="" id="80" name="Picture"/>
             <a:graphic>
               <a:graphicData uri="http://schemas.openxmlformats.org/drawingml/2006/picture">
                 <pic:pic>
                   <pic:nvPicPr>
-                    <pic:cNvPr descr="auroc_ci.png" id="80" name="Picture"/>
+                    <pic:cNvPr descr="auroc_ci.png" id="81" name="Picture"/>
                     <pic:cNvPicPr>
                       <a:picLocks noChangeArrowheads="1" noChangeAspect="1"/>
                     </pic:cNvPicPr>
                   </pic:nvPicPr>
                   <pic:blipFill>
-                    <a:blip r:embed="rId78"/>
+                    <a:blip r:embed="rId79"/>
                     <a:stretch>
                       <a:fillRect/>
                     </a:stretch>
@@ -9148,7 +9112,7 @@
                   <pic:spPr bwMode="auto">
                     <a:xfrm>
                       <a:off x="0" y="0"/>
-                      <a:ext cx="6400800" cy="1845564"/>
+                      <a:ext cx="6400800" cy="4405884"/>
                     </a:xfrm>
                     <a:prstGeom prst="rect">
                       <a:avLst/>
@@ -9205,8 +9169,8 @@
         <w:t xml:space="preserve">Elliptic Envelope.</w:t>
       </w:r>
     </w:p>
-    <w:bookmarkEnd w:id="81"/>
-    <w:bookmarkStart w:id="82" w:name="tab:swat"/>
+    <w:bookmarkEnd w:id="82"/>
+    <w:bookmarkStart w:id="83" w:name="tab:swat"/>
     <w:tbl>
       <w:tblPr>
         <w:tblStyle w:val="Table"/>
@@ -10224,8 +10188,8 @@
         <w:t xml:space="preserve">scored on the last two thirds.</w:t>
       </w:r>
     </w:p>
-    <w:bookmarkEnd w:id="82"/>
-    <w:bookmarkStart w:id="83" w:name="tab:hai"/>
+    <w:bookmarkEnd w:id="83"/>
+    <w:bookmarkStart w:id="84" w:name="tab:hai"/>
     <w:tbl>
       <w:tblPr>
         <w:tblStyle w:val="Table"/>
@@ -11231,8 +11195,8 @@
         <w:t xml:space="preserve">file 1, scored on files 2–5.</w:t>
       </w:r>
     </w:p>
-    <w:bookmarkEnd w:id="83"/>
-    <w:bookmarkStart w:id="84" w:name="tab:wadi"/>
+    <w:bookmarkEnd w:id="84"/>
+    <w:bookmarkStart w:id="85" w:name="tab:wadi"/>
     <w:tbl>
       <w:tblPr>
         <w:tblStyle w:val="Table"/>
@@ -12267,8 +12231,8 @@
         <w:t xml:space="preserve">(one-hour blocks); label-free MCC and false-alarm rate on normal test rows.</w:t>
       </w:r>
     </w:p>
-    <w:bookmarkEnd w:id="84"/>
-    <w:bookmarkStart w:id="88" w:name="fig:protocol"/>
+    <w:bookmarkEnd w:id="85"/>
+    <w:bookmarkStart w:id="89" w:name="fig:protocol"/>
     <w:p>
       <w:pPr>
         <w:pStyle w:val="phmfigures"/>
@@ -12278,18 +12242,18 @@
           <wp:inline>
             <wp:extent cx="6400800" cy="2277618"/>
             <wp:effectExtent b="0" l="0" r="0" t="0"/>
-            <wp:docPr descr="" title="" id="86" name="Picture"/>
+            <wp:docPr descr="" title="" id="87" name="Picture"/>
             <a:graphic>
               <a:graphicData uri="http://schemas.openxmlformats.org/drawingml/2006/picture">
                 <pic:pic>
                   <pic:nvPicPr>
-                    <pic:cNvPr descr="protocol_sensitivity.png" id="87" name="Picture"/>
+                    <pic:cNvPr descr="protocol_sensitivity.png" id="88" name="Picture"/>
                     <pic:cNvPicPr>
                       <a:picLocks noChangeArrowheads="1" noChangeAspect="1"/>
                     </pic:cNvPicPr>
                   </pic:nvPicPr>
                   <pic:blipFill>
-                    <a:blip r:embed="rId85"/>
+                    <a:blip r:embed="rId86"/>
                     <a:stretch>
                       <a:fillRect/>
                     </a:stretch>
@@ -12342,8 +12306,8 @@
         <w:t xml:space="preserve">on its first 400 rows (SKAB reference protocol; mean over runs).</w:t>
       </w:r>
     </w:p>
-    <w:bookmarkEnd w:id="88"/>
-    <w:bookmarkStart w:id="89" w:name="tab:skabbench"/>
+    <w:bookmarkEnd w:id="89"/>
+    <w:bookmarkStart w:id="90" w:name="tab:skabbench"/>
     <w:tbl>
       <w:tblPr>
         <w:tblStyle w:val="Table"/>
@@ -13130,14 +13094,14 @@
         <w:t xml:space="preserve">SKAB benchmark (false-alarm and missed-alarm rates).</w:t>
       </w:r>
     </w:p>
-    <w:bookmarkEnd w:id="89"/>
-    <w:bookmarkStart w:id="90" w:name="tab:drift"/>
+    <w:bookmarkEnd w:id="90"/>
+    <w:bookmarkStart w:id="91" w:name="tab:drift"/>
     <w:tbl>
       <w:tblPr>
         <w:tblStyle w:val="Table"/>
         <w:tblW w:type="auto" w:w="0"/>
         <w:tblLook w:firstRow="1" w:lastRow="0" w:firstColumn="0" w:lastColumn="0" w:noHBand="0" w:noVBand="0" w:val="0020"/>
-        <w:tblCaption w:val="Retraining budget on SWaT: MCC over the attack period (point-wise) for each detector and retraining-data selection, at every periodic budget P (refit attempt every P hourly batches; 244 batches in total) and for the KS-triggered policy. The number in brackets is the number of successful refits. Static: Isolation Forest 0.167, Elliptic Envelope 0.723."/>
+        <w:tblCaption w:val="Retraining budget on SWaT (official release, 25 sensors): MCC over the attack period (point-wise) for each detector and retraining-data selection, at every periodic budget P (refit attempt every P hourly batches; 244 batches in total) and for the KS-triggered policy. The number in brackets is the number of successful refits. Static: Isolation Forest 0.165, Elliptic Envelope 0.724."/>
       </w:tblPr>
       <w:tblGrid>
         <w:gridCol w:w="792"/>
@@ -13382,91 +13346,91 @@
               <w:jc w:val="center"/>
             </w:pPr>
             <w:r>
-              <w:t xml:space="preserve">0.537 (239)</w:t>
-            </w:r>
-          </w:p>
-        </w:tc>
-        <w:tc>
-          <w:tcPr/>
-          <w:p>
-            <w:pPr>
-              <w:pStyle w:val="Compact"/>
-              <w:jc w:val="center"/>
-            </w:pPr>
-            <w:r>
-              <w:t xml:space="preserve">0.485 (120)</w:t>
-            </w:r>
-          </w:p>
-        </w:tc>
-        <w:tc>
-          <w:tcPr/>
-          <w:p>
-            <w:pPr>
-              <w:pStyle w:val="Compact"/>
-              <w:jc w:val="center"/>
-            </w:pPr>
-            <w:r>
-              <w:t xml:space="preserve">0.456 (80)</w:t>
-            </w:r>
-          </w:p>
-        </w:tc>
-        <w:tc>
-          <w:tcPr/>
-          <w:p>
-            <w:pPr>
-              <w:pStyle w:val="Compact"/>
-              <w:jc w:val="center"/>
-            </w:pPr>
-            <w:r>
-              <w:t xml:space="preserve">0.380 (40)</w:t>
-            </w:r>
-          </w:p>
-        </w:tc>
-        <w:tc>
-          <w:tcPr/>
-          <w:p>
-            <w:pPr>
-              <w:pStyle w:val="Compact"/>
-              <w:jc w:val="center"/>
-            </w:pPr>
-            <w:r>
-              <w:t xml:space="preserve">0.325 (20)</w:t>
-            </w:r>
-          </w:p>
-        </w:tc>
-        <w:tc>
-          <w:tcPr/>
-          <w:p>
-            <w:pPr>
-              <w:pStyle w:val="Compact"/>
-              <w:jc w:val="center"/>
-            </w:pPr>
-            <w:r>
-              <w:t xml:space="preserve">0.254 (10)</w:t>
-            </w:r>
-          </w:p>
-        </w:tc>
-        <w:tc>
-          <w:tcPr/>
-          <w:p>
-            <w:pPr>
-              <w:pStyle w:val="Compact"/>
-              <w:jc w:val="center"/>
-            </w:pPr>
-            <w:r>
-              <w:t xml:space="preserve">0.276 (5)</w:t>
-            </w:r>
-          </w:p>
-        </w:tc>
-        <w:tc>
-          <w:tcPr/>
-          <w:p>
-            <w:pPr>
-              <w:pStyle w:val="Compact"/>
-              <w:jc w:val="center"/>
-            </w:pPr>
-            <w:r>
-              <w:t xml:space="preserve">0.488 (74)</w:t>
+              <w:t xml:space="preserve">0.567 (239)</w:t>
+            </w:r>
+          </w:p>
+        </w:tc>
+        <w:tc>
+          <w:tcPr/>
+          <w:p>
+            <w:pPr>
+              <w:pStyle w:val="Compact"/>
+              <w:jc w:val="center"/>
+            </w:pPr>
+            <w:r>
+              <w:t xml:space="preserve">0.502 (120)</w:t>
+            </w:r>
+          </w:p>
+        </w:tc>
+        <w:tc>
+          <w:tcPr/>
+          <w:p>
+            <w:pPr>
+              <w:pStyle w:val="Compact"/>
+              <w:jc w:val="center"/>
+            </w:pPr>
+            <w:r>
+              <w:t xml:space="preserve">0.478 (80)</w:t>
+            </w:r>
+          </w:p>
+        </w:tc>
+        <w:tc>
+          <w:tcPr/>
+          <w:p>
+            <w:pPr>
+              <w:pStyle w:val="Compact"/>
+              <w:jc w:val="center"/>
+            </w:pPr>
+            <w:r>
+              <w:t xml:space="preserve">0.404 (40)</w:t>
+            </w:r>
+          </w:p>
+        </w:tc>
+        <w:tc>
+          <w:tcPr/>
+          <w:p>
+            <w:pPr>
+              <w:pStyle w:val="Compact"/>
+              <w:jc w:val="center"/>
+            </w:pPr>
+            <w:r>
+              <w:t xml:space="preserve">0.349 (20)</w:t>
+            </w:r>
+          </w:p>
+        </w:tc>
+        <w:tc>
+          <w:tcPr/>
+          <w:p>
+            <w:pPr>
+              <w:pStyle w:val="Compact"/>
+              <w:jc w:val="center"/>
+            </w:pPr>
+            <w:r>
+              <w:t xml:space="preserve">0.297 (10)</w:t>
+            </w:r>
+          </w:p>
+        </w:tc>
+        <w:tc>
+          <w:tcPr/>
+          <w:p>
+            <w:pPr>
+              <w:pStyle w:val="Compact"/>
+              <w:jc w:val="center"/>
+            </w:pPr>
+            <w:r>
+              <w:t xml:space="preserve">0.288 (5)</w:t>
+            </w:r>
+          </w:p>
+        </w:tc>
+        <w:tc>
+          <w:tcPr/>
+          <w:p>
+            <w:pPr>
+              <w:pStyle w:val="Compact"/>
+              <w:jc w:val="center"/>
+            </w:pPr>
+            <w:r>
+              <w:t xml:space="preserve">0.549 (89)</w:t>
             </w:r>
           </w:p>
         </w:tc>
@@ -13500,31 +13464,31 @@
               <w:jc w:val="center"/>
             </w:pPr>
             <w:r>
-              <w:t xml:space="preserve">0.001 (52)</w:t>
-            </w:r>
-          </w:p>
-        </w:tc>
-        <w:tc>
-          <w:tcPr/>
-          <w:p>
-            <w:pPr>
-              <w:pStyle w:val="Compact"/>
-              <w:jc w:val="center"/>
-            </w:pPr>
-            <w:r>
-              <w:t xml:space="preserve">0.286 (105)</w:t>
-            </w:r>
-          </w:p>
-        </w:tc>
-        <w:tc>
-          <w:tcPr/>
-          <w:p>
-            <w:pPr>
-              <w:pStyle w:val="Compact"/>
-              <w:jc w:val="center"/>
-            </w:pPr>
-            <w:r>
-              <w:t xml:space="preserve">0.004 (25)</w:t>
+              <w:t xml:space="preserve">0.004 (95)</w:t>
+            </w:r>
+          </w:p>
+        </w:tc>
+        <w:tc>
+          <w:tcPr/>
+          <w:p>
+            <w:pPr>
+              <w:pStyle w:val="Compact"/>
+              <w:jc w:val="center"/>
+            </w:pPr>
+            <w:r>
+              <w:t xml:space="preserve">0.000 (12)</w:t>
+            </w:r>
+          </w:p>
+        </w:tc>
+        <w:tc>
+          <w:tcPr/>
+          <w:p>
+            <w:pPr>
+              <w:pStyle w:val="Compact"/>
+              <w:jc w:val="center"/>
+            </w:pPr>
+            <w:r>
+              <w:t xml:space="preserve">0.000 (14)</w:t>
             </w:r>
           </w:p>
         </w:tc>
@@ -13548,43 +13512,43 @@
               <w:jc w:val="center"/>
             </w:pPr>
             <w:r>
-              <w:t xml:space="preserve">0.000 (4)</w:t>
-            </w:r>
-          </w:p>
-        </w:tc>
-        <w:tc>
-          <w:tcPr/>
-          <w:p>
-            <w:pPr>
-              <w:pStyle w:val="Compact"/>
-              <w:jc w:val="center"/>
-            </w:pPr>
-            <w:r>
-              <w:t xml:space="preserve">0.033 (4)</w:t>
-            </w:r>
-          </w:p>
-        </w:tc>
-        <w:tc>
-          <w:tcPr/>
-          <w:p>
-            <w:pPr>
-              <w:pStyle w:val="Compact"/>
-              <w:jc w:val="center"/>
-            </w:pPr>
-            <w:r>
-              <w:t xml:space="preserve">0.005 (1)</w:t>
-            </w:r>
-          </w:p>
-        </w:tc>
-        <w:tc>
-          <w:tcPr/>
-          <w:p>
-            <w:pPr>
-              <w:pStyle w:val="Compact"/>
-              <w:jc w:val="center"/>
-            </w:pPr>
-            <w:r>
-              <w:t xml:space="preserve">0.025 (52)</w:t>
+              <w:t xml:space="preserve">0.000 (3)</w:t>
+            </w:r>
+          </w:p>
+        </w:tc>
+        <w:tc>
+          <w:tcPr/>
+          <w:p>
+            <w:pPr>
+              <w:pStyle w:val="Compact"/>
+              <w:jc w:val="center"/>
+            </w:pPr>
+            <w:r>
+              <w:t xml:space="preserve">0.008 (2)</w:t>
+            </w:r>
+          </w:p>
+        </w:tc>
+        <w:tc>
+          <w:tcPr/>
+          <w:p>
+            <w:pPr>
+              <w:pStyle w:val="Compact"/>
+              <w:jc w:val="center"/>
+            </w:pPr>
+            <w:r>
+              <w:t xml:space="preserve">0.069 (3)</w:t>
+            </w:r>
+          </w:p>
+        </w:tc>
+        <w:tc>
+          <w:tcPr/>
+          <w:p>
+            <w:pPr>
+              <w:pStyle w:val="Compact"/>
+              <w:jc w:val="center"/>
+            </w:pPr>
+            <w:r>
+              <w:t xml:space="preserve">0.000 (24)</w:t>
             </w:r>
           </w:p>
         </w:tc>
@@ -13618,91 +13582,91 @@
               <w:jc w:val="center"/>
             </w:pPr>
             <w:r>
-              <w:t xml:space="preserve">0.226 (244)</w:t>
-            </w:r>
-          </w:p>
-        </w:tc>
-        <w:tc>
-          <w:tcPr/>
-          <w:p>
-            <w:pPr>
-              <w:pStyle w:val="Compact"/>
-              <w:jc w:val="center"/>
-            </w:pPr>
-            <w:r>
-              <w:t xml:space="preserve">0.147 (122)</w:t>
-            </w:r>
-          </w:p>
-        </w:tc>
-        <w:tc>
-          <w:tcPr/>
-          <w:p>
-            <w:pPr>
-              <w:pStyle w:val="Compact"/>
-              <w:jc w:val="center"/>
-            </w:pPr>
-            <w:r>
-              <w:t xml:space="preserve">0.303 (81)</w:t>
-            </w:r>
-          </w:p>
-        </w:tc>
-        <w:tc>
-          <w:tcPr/>
-          <w:p>
-            <w:pPr>
-              <w:pStyle w:val="Compact"/>
-              <w:jc w:val="center"/>
-            </w:pPr>
-            <w:r>
-              <w:t xml:space="preserve">0.124 (40)</w:t>
-            </w:r>
-          </w:p>
-        </w:tc>
-        <w:tc>
-          <w:tcPr/>
-          <w:p>
-            <w:pPr>
-              <w:pStyle w:val="Compact"/>
-              <w:jc w:val="center"/>
-            </w:pPr>
-            <w:r>
-              <w:t xml:space="preserve">0.301 (20)</w:t>
-            </w:r>
-          </w:p>
-        </w:tc>
-        <w:tc>
-          <w:tcPr/>
-          <w:p>
-            <w:pPr>
-              <w:pStyle w:val="Compact"/>
-              <w:jc w:val="center"/>
-            </w:pPr>
-            <w:r>
-              <w:t xml:space="preserve">0.225 (10)</w:t>
-            </w:r>
-          </w:p>
-        </w:tc>
-        <w:tc>
-          <w:tcPr/>
-          <w:p>
-            <w:pPr>
-              <w:pStyle w:val="Compact"/>
-              <w:jc w:val="center"/>
-            </w:pPr>
-            <w:r>
-              <w:t xml:space="preserve">0.200 (5)</w:t>
-            </w:r>
-          </w:p>
-        </w:tc>
-        <w:tc>
-          <w:tcPr/>
-          <w:p>
-            <w:pPr>
-              <w:pStyle w:val="Compact"/>
-              <w:jc w:val="center"/>
-            </w:pPr>
-            <w:r>
-              <w:t xml:space="preserve">0.188 (79)</w:t>
+              <w:t xml:space="preserve">0.206 (244)</w:t>
+            </w:r>
+          </w:p>
+        </w:tc>
+        <w:tc>
+          <w:tcPr/>
+          <w:p>
+            <w:pPr>
+              <w:pStyle w:val="Compact"/>
+              <w:jc w:val="center"/>
+            </w:pPr>
+            <w:r>
+              <w:t xml:space="preserve">0.149 (122)</w:t>
+            </w:r>
+          </w:p>
+        </w:tc>
+        <w:tc>
+          <w:tcPr/>
+          <w:p>
+            <w:pPr>
+              <w:pStyle w:val="Compact"/>
+              <w:jc w:val="center"/>
+            </w:pPr>
+            <w:r>
+              <w:t xml:space="preserve">0.255 (81)</w:t>
+            </w:r>
+          </w:p>
+        </w:tc>
+        <w:tc>
+          <w:tcPr/>
+          <w:p>
+            <w:pPr>
+              <w:pStyle w:val="Compact"/>
+              <w:jc w:val="center"/>
+            </w:pPr>
+            <w:r>
+              <w:t xml:space="preserve">0.138 (40)</w:t>
+            </w:r>
+          </w:p>
+        </w:tc>
+        <w:tc>
+          <w:tcPr/>
+          <w:p>
+            <w:pPr>
+              <w:pStyle w:val="Compact"/>
+              <w:jc w:val="center"/>
+            </w:pPr>
+            <w:r>
+              <w:t xml:space="preserve">0.292 (20)</w:t>
+            </w:r>
+          </w:p>
+        </w:tc>
+        <w:tc>
+          <w:tcPr/>
+          <w:p>
+            <w:pPr>
+              <w:pStyle w:val="Compact"/>
+              <w:jc w:val="center"/>
+            </w:pPr>
+            <w:r>
+              <w:t xml:space="preserve">0.221 (10)</w:t>
+            </w:r>
+          </w:p>
+        </w:tc>
+        <w:tc>
+          <w:tcPr/>
+          <w:p>
+            <w:pPr>
+              <w:pStyle w:val="Compact"/>
+              <w:jc w:val="center"/>
+            </w:pPr>
+            <w:r>
+              <w:t xml:space="preserve">0.153 (5)</w:t>
+            </w:r>
+          </w:p>
+        </w:tc>
+        <w:tc>
+          <w:tcPr/>
+          <w:p>
+            <w:pPr>
+              <w:pStyle w:val="Compact"/>
+              <w:jc w:val="center"/>
+            </w:pPr>
+            <w:r>
+              <w:t xml:space="preserve">0.188 (92)</w:t>
             </w:r>
           </w:p>
         </w:tc>
@@ -13740,55 +13704,55 @@
               <w:jc w:val="center"/>
             </w:pPr>
             <w:r>
-              <w:t xml:space="preserve">0.711 (239)</w:t>
-            </w:r>
-          </w:p>
-        </w:tc>
-        <w:tc>
-          <w:tcPr/>
-          <w:p>
-            <w:pPr>
-              <w:pStyle w:val="Compact"/>
-              <w:jc w:val="center"/>
-            </w:pPr>
-            <w:r>
-              <w:t xml:space="preserve">0.707 (120)</w:t>
-            </w:r>
-          </w:p>
-        </w:tc>
-        <w:tc>
-          <w:tcPr/>
-          <w:p>
-            <w:pPr>
-              <w:pStyle w:val="Compact"/>
-              <w:jc w:val="center"/>
-            </w:pPr>
-            <w:r>
-              <w:t xml:space="preserve">0.717 (80)</w:t>
-            </w:r>
-          </w:p>
-        </w:tc>
-        <w:tc>
-          <w:tcPr/>
-          <w:p>
-            <w:pPr>
-              <w:pStyle w:val="Compact"/>
-              <w:jc w:val="center"/>
-            </w:pPr>
-            <w:r>
-              <w:t xml:space="preserve">0.726 (40)</w:t>
-            </w:r>
-          </w:p>
-        </w:tc>
-        <w:tc>
-          <w:tcPr/>
-          <w:p>
-            <w:pPr>
-              <w:pStyle w:val="Compact"/>
-              <w:jc w:val="center"/>
-            </w:pPr>
-            <w:r>
-              <w:t xml:space="preserve">0.719 (20)</w:t>
+              <w:t xml:space="preserve">0.705 (239)</w:t>
+            </w:r>
+          </w:p>
+        </w:tc>
+        <w:tc>
+          <w:tcPr/>
+          <w:p>
+            <w:pPr>
+              <w:pStyle w:val="Compact"/>
+              <w:jc w:val="center"/>
+            </w:pPr>
+            <w:r>
+              <w:t xml:space="preserve">0.706 (120)</w:t>
+            </w:r>
+          </w:p>
+        </w:tc>
+        <w:tc>
+          <w:tcPr/>
+          <w:p>
+            <w:pPr>
+              <w:pStyle w:val="Compact"/>
+              <w:jc w:val="center"/>
+            </w:pPr>
+            <w:r>
+              <w:t xml:space="preserve">0.716 (80)</w:t>
+            </w:r>
+          </w:p>
+        </w:tc>
+        <w:tc>
+          <w:tcPr/>
+          <w:p>
+            <w:pPr>
+              <w:pStyle w:val="Compact"/>
+              <w:jc w:val="center"/>
+            </w:pPr>
+            <w:r>
+              <w:t xml:space="preserve">0.722 (40)</w:t>
+            </w:r>
+          </w:p>
+        </w:tc>
+        <w:tc>
+          <w:tcPr/>
+          <w:p>
+            <w:pPr>
+              <w:pStyle w:val="Compact"/>
+              <w:jc w:val="center"/>
+            </w:pPr>
+            <w:r>
+              <w:t xml:space="preserve">0.727 (20)</w:t>
             </w:r>
           </w:p>
         </w:tc>
@@ -13812,19 +13776,19 @@
               <w:jc w:val="center"/>
             </w:pPr>
             <w:r>
-              <w:t xml:space="preserve">0.731 (5)</w:t>
-            </w:r>
-          </w:p>
-        </w:tc>
-        <w:tc>
-          <w:tcPr/>
-          <w:p>
-            <w:pPr>
-              <w:pStyle w:val="Compact"/>
-              <w:jc w:val="center"/>
-            </w:pPr>
-            <w:r>
-              <w:t xml:space="preserve">0.709 (74)</w:t>
+              <w:t xml:space="preserve">0.732 (5)</w:t>
+            </w:r>
+          </w:p>
+        </w:tc>
+        <w:tc>
+          <w:tcPr/>
+          <w:p>
+            <w:pPr>
+              <w:pStyle w:val="Compact"/>
+              <w:jc w:val="center"/>
+            </w:pPr>
+            <w:r>
+              <w:t xml:space="preserve">0.709 (89)</w:t>
             </w:r>
           </w:p>
         </w:tc>
@@ -13858,91 +13822,91 @@
               <w:jc w:val="center"/>
             </w:pPr>
             <w:r>
-              <w:t xml:space="preserve">0.683 (238)</w:t>
-            </w:r>
-          </w:p>
-        </w:tc>
-        <w:tc>
-          <w:tcPr/>
-          <w:p>
-            <w:pPr>
-              <w:pStyle w:val="Compact"/>
-              <w:jc w:val="center"/>
-            </w:pPr>
-            <w:r>
-              <w:t xml:space="preserve">0.729 (120)</w:t>
-            </w:r>
-          </w:p>
-        </w:tc>
-        <w:tc>
-          <w:tcPr/>
-          <w:p>
-            <w:pPr>
-              <w:pStyle w:val="Compact"/>
-              <w:jc w:val="center"/>
-            </w:pPr>
-            <w:r>
-              <w:t xml:space="preserve">0.734 (80)</w:t>
-            </w:r>
-          </w:p>
-        </w:tc>
-        <w:tc>
-          <w:tcPr/>
-          <w:p>
-            <w:pPr>
-              <w:pStyle w:val="Compact"/>
-              <w:jc w:val="center"/>
-            </w:pPr>
-            <w:r>
-              <w:t xml:space="preserve">0.711 (39)</w:t>
-            </w:r>
-          </w:p>
-        </w:tc>
-        <w:tc>
-          <w:tcPr/>
-          <w:p>
-            <w:pPr>
-              <w:pStyle w:val="Compact"/>
-              <w:jc w:val="center"/>
-            </w:pPr>
-            <w:r>
-              <w:t xml:space="preserve">0.738 (20)</w:t>
-            </w:r>
-          </w:p>
-        </w:tc>
-        <w:tc>
-          <w:tcPr/>
-          <w:p>
-            <w:pPr>
-              <w:pStyle w:val="Compact"/>
-              <w:jc w:val="center"/>
-            </w:pPr>
-            <w:r>
-              <w:t xml:space="preserve">0.748 (10)</w:t>
-            </w:r>
-          </w:p>
-        </w:tc>
-        <w:tc>
-          <w:tcPr/>
-          <w:p>
-            <w:pPr>
-              <w:pStyle w:val="Compact"/>
-              <w:jc w:val="center"/>
-            </w:pPr>
-            <w:r>
-              <w:t xml:space="preserve">0.740 (5)</w:t>
-            </w:r>
-          </w:p>
-        </w:tc>
-        <w:tc>
-          <w:tcPr/>
-          <w:p>
-            <w:pPr>
-              <w:pStyle w:val="Compact"/>
-              <w:jc w:val="center"/>
-            </w:pPr>
-            <w:r>
-              <w:t xml:space="preserve">0.725 (73)</w:t>
+              <w:t xml:space="preserve">0.719 (239)</w:t>
+            </w:r>
+          </w:p>
+        </w:tc>
+        <w:tc>
+          <w:tcPr/>
+          <w:p>
+            <w:pPr>
+              <w:pStyle w:val="Compact"/>
+              <w:jc w:val="center"/>
+            </w:pPr>
+            <w:r>
+              <w:t xml:space="preserve">0.724 (120)</w:t>
+            </w:r>
+          </w:p>
+        </w:tc>
+        <w:tc>
+          <w:tcPr/>
+          <w:p>
+            <w:pPr>
+              <w:pStyle w:val="Compact"/>
+              <w:jc w:val="center"/>
+            </w:pPr>
+            <w:r>
+              <w:t xml:space="preserve">0.704 (79)</w:t>
+            </w:r>
+          </w:p>
+        </w:tc>
+        <w:tc>
+          <w:tcPr/>
+          <w:p>
+            <w:pPr>
+              <w:pStyle w:val="Compact"/>
+              <w:jc w:val="center"/>
+            </w:pPr>
+            <w:r>
+              <w:t xml:space="preserve">0.703 (39)</w:t>
+            </w:r>
+          </w:p>
+        </w:tc>
+        <w:tc>
+          <w:tcPr/>
+          <w:p>
+            <w:pPr>
+              <w:pStyle w:val="Compact"/>
+              <w:jc w:val="center"/>
+            </w:pPr>
+            <w:r>
+              <w:t xml:space="preserve">0.723 (20)</w:t>
+            </w:r>
+          </w:p>
+        </w:tc>
+        <w:tc>
+          <w:tcPr/>
+          <w:p>
+            <w:pPr>
+              <w:pStyle w:val="Compact"/>
+              <w:jc w:val="center"/>
+            </w:pPr>
+            <w:r>
+              <w:t xml:space="preserve">0.746 (10)</w:t>
+            </w:r>
+          </w:p>
+        </w:tc>
+        <w:tc>
+          <w:tcPr/>
+          <w:p>
+            <w:pPr>
+              <w:pStyle w:val="Compact"/>
+              <w:jc w:val="center"/>
+            </w:pPr>
+            <w:r>
+              <w:t xml:space="preserve">0.749 (5)</w:t>
+            </w:r>
+          </w:p>
+        </w:tc>
+        <w:tc>
+          <w:tcPr/>
+          <w:p>
+            <w:pPr>
+              <w:pStyle w:val="Compact"/>
+              <w:jc w:val="center"/>
+            </w:pPr>
+            <w:r>
+              <w:t xml:space="preserve">0.703 (89)</w:t>
             </w:r>
           </w:p>
         </w:tc>
@@ -13976,7 +13940,7 @@
               <w:jc w:val="center"/>
             </w:pPr>
             <w:r>
-              <w:t xml:space="preserve">0.335 (244)</w:t>
+              <w:t xml:space="preserve">0.329 (244)</w:t>
             </w:r>
           </w:p>
         </w:tc>
@@ -14000,67 +13964,67 @@
               <w:jc w:val="center"/>
             </w:pPr>
             <w:r>
-              <w:t xml:space="preserve">0.418 (81)</w:t>
-            </w:r>
-          </w:p>
-        </w:tc>
-        <w:tc>
-          <w:tcPr/>
-          <w:p>
-            <w:pPr>
-              <w:pStyle w:val="Compact"/>
-              <w:jc w:val="center"/>
-            </w:pPr>
-            <w:r>
-              <w:t xml:space="preserve">0.423 (40)</w:t>
-            </w:r>
-          </w:p>
-        </w:tc>
-        <w:tc>
-          <w:tcPr/>
-          <w:p>
-            <w:pPr>
-              <w:pStyle w:val="Compact"/>
-              <w:jc w:val="center"/>
-            </w:pPr>
-            <w:r>
-              <w:t xml:space="preserve">0.717 (20)</w:t>
-            </w:r>
-          </w:p>
-        </w:tc>
-        <w:tc>
-          <w:tcPr/>
-          <w:p>
-            <w:pPr>
-              <w:pStyle w:val="Compact"/>
-              <w:jc w:val="center"/>
-            </w:pPr>
-            <w:r>
-              <w:t xml:space="preserve">0.701 (10)</w:t>
-            </w:r>
-          </w:p>
-        </w:tc>
-        <w:tc>
-          <w:tcPr/>
-          <w:p>
-            <w:pPr>
-              <w:pStyle w:val="Compact"/>
-              <w:jc w:val="center"/>
-            </w:pPr>
-            <w:r>
-              <w:t xml:space="preserve">0.683 (5)</w:t>
-            </w:r>
-          </w:p>
-        </w:tc>
-        <w:tc>
-          <w:tcPr/>
-          <w:p>
-            <w:pPr>
-              <w:pStyle w:val="Compact"/>
-              <w:jc w:val="center"/>
-            </w:pPr>
-            <w:r>
-              <w:t xml:space="preserve">0.332 (79)</w:t>
+              <w:t xml:space="preserve">0.420 (81)</w:t>
+            </w:r>
+          </w:p>
+        </w:tc>
+        <w:tc>
+          <w:tcPr/>
+          <w:p>
+            <w:pPr>
+              <w:pStyle w:val="Compact"/>
+              <w:jc w:val="center"/>
+            </w:pPr>
+            <w:r>
+              <w:t xml:space="preserve">0.422 (40)</w:t>
+            </w:r>
+          </w:p>
+        </w:tc>
+        <w:tc>
+          <w:tcPr/>
+          <w:p>
+            <w:pPr>
+              <w:pStyle w:val="Compact"/>
+              <w:jc w:val="center"/>
+            </w:pPr>
+            <w:r>
+              <w:t xml:space="preserve">0.718 (20)</w:t>
+            </w:r>
+          </w:p>
+        </w:tc>
+        <w:tc>
+          <w:tcPr/>
+          <w:p>
+            <w:pPr>
+              <w:pStyle w:val="Compact"/>
+              <w:jc w:val="center"/>
+            </w:pPr>
+            <w:r>
+              <w:t xml:space="preserve">0.697 (10)</w:t>
+            </w:r>
+          </w:p>
+        </w:tc>
+        <w:tc>
+          <w:tcPr/>
+          <w:p>
+            <w:pPr>
+              <w:pStyle w:val="Compact"/>
+              <w:jc w:val="center"/>
+            </w:pPr>
+            <w:r>
+              <w:t xml:space="preserve">0.678 (5)</w:t>
+            </w:r>
+          </w:p>
+        </w:tc>
+        <w:tc>
+          <w:tcPr/>
+          <w:p>
+            <w:pPr>
+              <w:pStyle w:val="Compact"/>
+              <w:jc w:val="center"/>
+            </w:pPr>
+            <w:r>
+              <w:t xml:space="preserve">0.334 (92)</w:t>
             </w:r>
           </w:p>
         </w:tc>
@@ -14071,13 +14035,19 @@
         <w:pStyle w:val="phmcaption"/>
       </w:pPr>
       <w:r>
-        <w:t xml:space="preserve">Retraining budget on SWaT: MCC over the attack period (point-wise) for each</w:t>
-      </w:r>
-      <w:r>
-        <w:t xml:space="preserve"> </w:t>
-      </w:r>
-      <w:r>
-        <w:t xml:space="preserve">detector and retraining-data selection, at every periodic budget</w:t>
+        <w:t xml:space="preserve">Retraining budget on SWaT (official release, 25 sensors): MCC over the attack</w:t>
+      </w:r>
+      <w:r>
+        <w:t xml:space="preserve"> </w:t>
+      </w:r>
+      <w:r>
+        <w:t xml:space="preserve">period (point-wise) for each detector and retraining-data selection, at every periodic</w:t>
+      </w:r>
+      <w:r>
+        <w:t xml:space="preserve"> </w:t>
+      </w:r>
+      <w:r>
+        <w:t xml:space="preserve">budget</w:t>
       </w:r>
       <w:r>
         <w:t xml:space="preserve"> </w:t>
@@ -14091,13 +14061,7 @@
         <w:t xml:space="preserve"> </w:t>
       </w:r>
       <w:r>
-        <w:t xml:space="preserve">(refit attempt</w:t>
-      </w:r>
-      <w:r>
-        <w:t xml:space="preserve"> </w:t>
-      </w:r>
-      <w:r>
-        <w:t xml:space="preserve">every</w:t>
+        <w:t xml:space="preserve">(refit attempt every</w:t>
       </w:r>
       <w:r>
         <w:t xml:space="preserve"> </w:t>
@@ -14111,23 +14075,23 @@
         <w:t xml:space="preserve"> </w:t>
       </w:r>
       <w:r>
-        <w:t xml:space="preserve">hourly batches; 244 batches in total) and for the KS-triggered policy. The</w:t>
-      </w:r>
-      <w:r>
-        <w:t xml:space="preserve"> </w:t>
-      </w:r>
-      <w:r>
-        <w:t xml:space="preserve">number in brackets is the number of successful refits. Static: Isolation Forest</w:t>
-      </w:r>
-      <w:r>
-        <w:t xml:space="preserve"> </w:t>
-      </w:r>
-      <w:r>
-        <w:t xml:space="preserve">0.167, Elliptic Envelope 0.723.</w:t>
-      </w:r>
-    </w:p>
-    <w:bookmarkEnd w:id="90"/>
-    <w:bookmarkStart w:id="94" w:name="fig:drift"/>
+        <w:t xml:space="preserve">hourly batches; 244 batches in total) and for the</w:t>
+      </w:r>
+      <w:r>
+        <w:t xml:space="preserve"> </w:t>
+      </w:r>
+      <w:r>
+        <w:t xml:space="preserve">KS-triggered policy. The number in brackets is the number of successful refits. Static:</w:t>
+      </w:r>
+      <w:r>
+        <w:t xml:space="preserve"> </w:t>
+      </w:r>
+      <w:r>
+        <w:t xml:space="preserve">Isolation Forest 0.165, Elliptic Envelope 0.724.</w:t>
+      </w:r>
+    </w:p>
+    <w:bookmarkEnd w:id="91"/>
+    <w:bookmarkStart w:id="95" w:name="fig:drift"/>
     <w:p>
       <w:pPr>
         <w:pStyle w:val="phmfigures"/>
@@ -14137,18 +14101,18 @@
           <wp:inline>
             <wp:extent cx="6400800" cy="2128266"/>
             <wp:effectExtent b="0" l="0" r="0" t="0"/>
-            <wp:docPr descr="" title="" id="92" name="Picture"/>
+            <wp:docPr descr="" title="" id="93" name="Picture"/>
             <a:graphic>
               <a:graphicData uri="http://schemas.openxmlformats.org/drawingml/2006/picture">
                 <pic:pic>
                   <pic:nvPicPr>
-                    <pic:cNvPr descr="drift_policies.png" id="93" name="Picture"/>
+                    <pic:cNvPr descr="drift_policies.png" id="94" name="Picture"/>
                     <pic:cNvPicPr>
                       <a:picLocks noChangeArrowheads="1" noChangeAspect="1"/>
                     </pic:cNvPicPr>
                   </pic:nvPicPr>
                   <pic:blipFill>
-                    <a:blip r:embed="rId91"/>
+                    <a:blip r:embed="rId92"/>
                     <a:stretch>
                       <a:fillRect/>
                     </a:stretch>
@@ -14180,25 +14144,25 @@
         <w:pStyle w:val="phmcaption"/>
       </w:pPr>
       <w:r>
-        <w:t xml:space="preserve">Left: false-alarm rate of a static Isolation Forest over SWaT’s genuine normal</w:t>
-      </w:r>
-      <w:r>
-        <w:t xml:space="preserve"> </w:t>
-      </w:r>
-      <w:r>
-        <w:t xml:space="preserve">week (threshold set to flag 1% of its training window). Middle and right: detection</w:t>
-      </w:r>
-      <w:r>
-        <w:t xml:space="preserve"> </w:t>
-      </w:r>
-      <w:r>
-        <w:t xml:space="preserve">skill (MCC) over the attack period against the number of successful refits; lines are</w:t>
-      </w:r>
-      <w:r>
-        <w:t xml:space="preserve"> </w:t>
-      </w:r>
-      <w:r>
-        <w:t xml:space="preserve">periodic retraining at different budgets, stars the KS-triggered policy, the dashed line</w:t>
+        <w:t xml:space="preserve">Left: false-alarm rate of a static Isolation Forest over SWaT’s normal week</w:t>
+      </w:r>
+      <w:r>
+        <w:t xml:space="preserve"> </w:t>
+      </w:r>
+      <w:r>
+        <w:t xml:space="preserve">(official release; threshold set to flag 1% of its training window). Middle and right:</w:t>
+      </w:r>
+      <w:r>
+        <w:t xml:space="preserve"> </w:t>
+      </w:r>
+      <w:r>
+        <w:t xml:space="preserve">detection skill (MCC) over the attack period against the number of successful refits; lines</w:t>
+      </w:r>
+      <w:r>
+        <w:t xml:space="preserve"> </w:t>
+      </w:r>
+      <w:r>
+        <w:t xml:space="preserve">are periodic retraining at different budgets, stars the KS-triggered policy, the dashed line</w:t>
       </w:r>
       <w:r>
         <w:t xml:space="preserve"> </w:t>
@@ -14207,8 +14171,8 @@
         <w:t xml:space="preserve">the static model. Colours give the retraining-data selection.</w:t>
       </w:r>
     </w:p>
-    <w:bookmarkEnd w:id="94"/>
-    <w:bookmarkStart w:id="95" w:name="tab:edge"/>
+    <w:bookmarkEnd w:id="95"/>
+    <w:bookmarkStart w:id="96" w:name="tab:edge"/>
     <w:tbl>
       <w:tblPr>
         <w:tblStyle w:val="Table"/>
@@ -15363,8 +15327,8 @@
         <w:t xml:space="preserve">increase above the 444 MB baseline during fitting and scoring.</w:t>
       </w:r>
     </w:p>
-    <w:bookmarkEnd w:id="95"/>
-    <w:bookmarkStart w:id="99" w:name="fig:edge"/>
+    <w:bookmarkEnd w:id="96"/>
+    <w:bookmarkStart w:id="100" w:name="fig:edge"/>
     <w:p>
       <w:pPr>
         <w:pStyle w:val="phmfigures"/>
@@ -15374,18 +15338,18 @@
           <wp:inline>
             <wp:extent cx="4800600" cy="2782347"/>
             <wp:effectExtent b="0" l="0" r="0" t="0"/>
-            <wp:docPr descr="" title="" id="97" name="Picture"/>
+            <wp:docPr descr="" title="" id="98" name="Picture"/>
             <a:graphic>
               <a:graphicData uri="http://schemas.openxmlformats.org/drawingml/2006/picture">
                 <pic:pic>
                   <pic:nvPicPr>
-                    <pic:cNvPr descr="edge_cost.png" id="98" name="Picture"/>
+                    <pic:cNvPr descr="edge_cost.png" id="99" name="Picture"/>
                     <pic:cNvPicPr>
                       <a:picLocks noChangeArrowheads="1" noChangeAspect="1"/>
                     </pic:cNvPicPr>
                   </pic:nvPicPr>
                   <pic:blipFill>
-                    <a:blip r:embed="rId96"/>
+                    <a:blip r:embed="rId97"/>
                     <a:stretch>
                       <a:fillRect/>
                     </a:stretch>
@@ -15426,8 +15390,8 @@
         <w:t xml:space="preserve">capped container, for SKAB-shaped (40 features) and SWaT-shaped (120 features) input.</w:t>
       </w:r>
     </w:p>
-    <w:bookmarkEnd w:id="99"/>
-    <w:bookmarkStart w:id="100" w:name="tab:synth"/>
+    <w:bookmarkEnd w:id="100"/>
+    <w:bookmarkStart w:id="101" w:name="tab:synth"/>
     <w:tbl>
       <w:tblPr>
         <w:tblStyle w:val="Table"/>
@@ -15738,7 +15702,7 @@
                 <m:t>→</m:t>
               </m:r>
               <m:r>
-                <m:t>0.54</m:t>
+                <m:t>0.57</m:t>
               </m:r>
             </m:oMath>
             <w:r>
@@ -15794,7 +15758,7 @@
               <w:jc w:val="left"/>
             </w:pPr>
             <w:r>
-              <w:t xml:space="preserve">KS trigger: 0.488 with 74 refits vs periodic 0.456 (80), 0.485 (120); KS checks 96 s vs every-batch refits 19 s</w:t>
+              <w:t xml:space="preserve">KS trigger: 0.549 with 89 refits vs periodic 0.478 (80), 0.502 (120), 0.567 (239); KS checks 98 s vs every-batch refits 18 s</w:t>
             </w:r>
           </w:p>
         </w:tc>
@@ -15864,8 +15828,8 @@
         <w:t xml:space="preserve">and the practical implication.</w:t>
       </w:r>
     </w:p>
-    <w:bookmarkEnd w:id="100"/>
     <w:bookmarkEnd w:id="101"/>
+    <w:bookmarkEnd w:id="102"/>
     <w:sectPr>
       <w:type w:val="nextPage"/>
       <w:pgSz w:w="12240" w:h="15840"/>

</xml_diff>

<commit_message>
Restore IJPHM header and footers in the Word manuscript
Co-Authored-By: Claude Opus 5.5 <noreply@anthropic.com>
</commit_message>
<xml_diff>
--- a/paper/current/Shah_IJPHM_Protocol_Sensitivity_Industrial_Anomaly_Detection.docx
+++ b/paper/current/Shah_IJPHM_Protocol_Sensitivity_Industrial_Anomaly_Detection.docx
@@ -343,10 +343,14 @@
       <w:pPr>
         <w:pStyle w:val="phmnormal"/>
         <w:sectPr>
+          <w:headerReference w:type="default" r:id="rId8"/>
+          <w:footerReference w:type="default" r:id="rId9"/>
+          <w:footerReference w:type="first" r:id="rId10"/>
           <w:type w:val="continuous"/>
           <w:pgSz w:w="12240" w:h="15840"/>
           <w:pgMar w:top="2160" w:right="1080" w:bottom="1440" w:left="1080" w:header="720" w:footer="720" w:gutter="0"/>
           <w:cols w:space="720"/>
+          <w:titlePg/>
         </w:sectPr>
       </w:pPr>
       <w:r>
@@ -7716,10 +7720,14 @@
     <w:p>
       <w:pPr>
         <w:sectPr>
+          <w:headerReference w:type="default" r:id="rId8"/>
+          <w:footerReference w:type="default" r:id="rId9"/>
+          <w:footerReference w:type="first" r:id="rId10"/>
           <w:type w:val="continuous"/>
           <w:pgSz w:w="12240" w:h="15840"/>
           <w:pgMar w:top="2160" w:right="1080" w:bottom="1440" w:left="1080" w:header="720" w:footer="720" w:gutter="0"/>
           <w:cols w:num="2" w:space="360"/>
+          <w:titlePg/>
         </w:sectPr>
       </w:pPr>
     </w:p>
@@ -19592,6 +19600,9 @@
     <w:bookmarkEnd w:id="101"/>
     <w:bookmarkEnd w:id="102"/>
     <w:sectPr>
+      <w:headerReference w:type="default" r:id="rId8"/>
+      <w:footerReference w:type="default" r:id="rId9"/>
+      <w:footerReference w:type="first" r:id="rId10"/>
       <w:type w:val="nextPage"/>
       <w:pgSz w:w="12240" w:h="15840"/>
       <w:pgMar w:top="2160" w:right="1080" w:bottom="1440" w:left="1080" w:header="720" w:footer="720" w:gutter="0"/>
@@ -19673,7 +19684,7 @@
       <w:rPr>
         <w:sz w:val="18"/>
       </w:rPr>
-      <w:t>Management, ISSN 2153-2648, 2012 ***</w:t>
+      <w:t>Management, ISSN 2153-2648, 2026 ***</w:t>
     </w:r>
   </w:p>
 </w:ftr>

</xml_diff>

<commit_message>
Third pre-submission review: soften SWaT equivalence claim, gap-aware WADI features
WADI rolling features and LSTM windows restart at the 73 h release gap;
both WADI runs redone (classical AUROC unchanged within 0.001); WADI table
regenerated from results; Overleaf figure copies synced.

Co-Authored-By: Claude Opus 5.5 <noreply@anthropic.com>
</commit_message>
<xml_diff>
--- a/paper/current/Shah_IJPHM_Protocol_Sensitivity_Industrial_Anomaly_Detection.docx
+++ b/paper/current/Shah_IJPHM_Protocol_Sensitivity_Industrial_Anomaly_Detection.docx
@@ -154,13 +154,19 @@
         <w:t xml:space="preserve"> </w:t>
       </w:r>
       <w:r>
-        <w:t xml:space="preserve">all ten detectors rank attacks equally well (AUROC 0.81–0.86, overlapping</w:t>
-      </w:r>
-      <w:r>
-        <w:t xml:space="preserve"> </w:t>
-      </w:r>
-      <w:r>
-        <w:t xml:space="preserve">intervals); on SKAB with pooled training all detectors are close to chance (best AUROC</w:t>
+        <w:t xml:space="preserve">all ten detectors reach AUROC 0.81–0.86 with overlapping intervals, and the two</w:t>
+      </w:r>
+      <w:r>
+        <w:t xml:space="preserve"> </w:t>
+      </w:r>
+      <w:r>
+        <w:t xml:space="preserve">highest-scoring are not significantly different (equivalence of all ten was not formally</w:t>
+      </w:r>
+      <w:r>
+        <w:t xml:space="preserve"> </w:t>
+      </w:r>
+      <w:r>
+        <w:t xml:space="preserve">tested); on SKAB with pooled training all detectors are close to chance (best AUROC</w:t>
       </w:r>
       <w:r>
         <w:t xml:space="preserve"> </w:t>
@@ -1700,13 +1706,19 @@
         <w:t xml:space="preserve"> </w:t>
       </w:r>
       <w:r>
-        <w:t xml:space="preserve">removed in the release; it lies in the training portion, so only the few rolling windows</w:t>
-      </w:r>
-      <w:r>
-        <w:t xml:space="preserve"> </w:t>
-      </w:r>
-      <w:r>
-        <w:t xml:space="preserve">that straddle it join non-adjacent readings.</w:t>
+        <w:t xml:space="preserve">removed in the release; it lies in the training portion, and rolling features and</w:t>
+      </w:r>
+      <w:r>
+        <w:t xml:space="preserve"> </w:t>
+      </w:r>
+      <w:r>
+        <w:t xml:space="preserve">autoencoder windows are restarted at it so that no window joins readings from either side.</w:t>
+      </w:r>
+      <w:r>
+        <w:t xml:space="preserve"> </w:t>
+      </w:r>
+      <w:r>
+        <w:t xml:space="preserve">Ignoring the gap changed no classical detector’s AUROC by more than 0.001.</w:t>
       </w:r>
     </w:p>
     <w:bookmarkEnd w:id="31"/>
@@ -3976,13 +3988,25 @@
         <w:t xml:space="preserve"> </w:t>
       </w:r>
       <w:r>
-        <w:t xml:space="preserve">CIs overlap almost completely; the difference between the top two (ECOD and COPOD) is</w:t>
-      </w:r>
-      <w:r>
-        <w:t xml:space="preserve"> </w:t>
-      </w:r>
-      <w:r>
-        <w:t xml:space="preserve">0.007 (CI −0.003 to 0.017). Isolation Forest’s AUROC is 0.824 for the seed-0</w:t>
+        <w:t xml:space="preserve">CIs overlap almost completely. The paired comparison of the two highest-scoring detectors</w:t>
+      </w:r>
+      <w:r>
+        <w:t xml:space="preserve"> </w:t>
+      </w:r>
+      <w:r>
+        <w:t xml:space="preserve">(ECOD and COPOD) gives a difference of 0.007 (CI −0.003 to 0.017), so no significant</w:t>
+      </w:r>
+      <w:r>
+        <w:t xml:space="preserve"> </w:t>
+      </w:r>
+      <w:r>
+        <w:t xml:space="preserve">difference is established between them; equivalence among all ten detectors was not</w:t>
+      </w:r>
+      <w:r>
+        <w:t xml:space="preserve"> </w:t>
+      </w:r>
+      <w:r>
+        <w:t xml:space="preserve">formally tested. Isolation Forest’s AUROC is 0.824 for the seed-0</w:t>
       </w:r>
       <w:r>
         <w:t xml:space="preserve"> </w:t>
@@ -4343,7 +4367,7 @@
         <w:t xml:space="preserve"> </w:t>
       </w:r>
       <w:r>
-        <w:t xml:space="preserve">per-feature detectors lead (HBOS AUROC 0.741, Isolation Forest 0.720, COPOD and ECOD</w:t>
+        <w:t xml:space="preserve">per-feature detectors lead (HBOS AUROC 0.742, Isolation Forest 0.720, COPOD and ECOD</w:t>
       </w:r>
       <w:r>
         <w:t xml:space="preserve"> </w:t>
@@ -4355,7 +4379,7 @@
         <w:t xml:space="preserve"> </w:t>
       </w:r>
       <w:r>
-        <w:t xml:space="preserve">Isolation Forest is 0.021, CI −0.018 to 0.063), while the</w:t>
+        <w:t xml:space="preserve">Isolation Forest is 0.021, CI −0.019 to 0.064), while the</w:t>
       </w:r>
       <w:r>
         <w:t xml:space="preserve"> </w:t>
@@ -4410,13 +4434,13 @@
         <w:t xml:space="preserve"> </w:t>
       </w:r>
       <w:r>
-        <w:t xml:space="preserve">rate falls to 0.6–1.4%, AUROC moves into a common band of 0.650–0.748 with</w:t>
-      </w:r>
-      <w:r>
-        <w:t xml:space="preserve"> </w:t>
-      </w:r>
-      <w:r>
-        <w:t xml:space="preserve">overlapping CIs, and label-free MCC reaches 0.351 for the LSTM autoencoder and</w:t>
+        <w:t xml:space="preserve">rate falls to 0.6–1.4%, AUROC moves into a common band of 0.649–0.748 with</w:t>
+      </w:r>
+      <w:r>
+        <w:t xml:space="preserve"> </w:t>
+      </w:r>
+      <w:r>
+        <w:t xml:space="preserve">overlapping CIs, and label-free MCC reaches 0.329 for the LSTM autoencoder and</w:t>
       </w:r>
       <w:r>
         <w:t xml:space="preserve"> </w:t>
@@ -4593,7 +4617,7 @@
         <w:t xml:space="preserve"> </w:t>
       </w:r>
       <w:r>
-        <w:t xml:space="preserve">re-upload leaves blank. Adding it leaves the ranking tied (AUROC 0.81–0.86) but</w:t>
+        <w:t xml:space="preserve">re-upload leaves blank. Adding it leaves AUROC in the same narrow range (0.81–0.86) but</w:t>
       </w:r>
       <w:r>
         <w:t xml:space="preserve"> </w:t>
@@ -5788,7 +5812,13 @@
         <w:t xml:space="preserve"> </w:t>
       </w:r>
       <w:r>
-        <w:t xml:space="preserve">paired difference between the top two includes zero), and on WADI they fall into a common</w:t>
+        <w:t xml:space="preserve">paired difference between the top two includes zero; equivalence of all ten was not</w:t>
+      </w:r>
+      <w:r>
+        <w:t xml:space="preserve"> </w:t>
+      </w:r>
+      <w:r>
+        <w:t xml:space="preserve">formally tested), and on WADI they fall into a common</w:t>
       </w:r>
       <w:r>
         <w:t xml:space="preserve"> </w:t>
@@ -6469,13 +6499,19 @@
         <w:t xml:space="preserve"> </w:t>
       </w:r>
       <w:r>
-        <w:t xml:space="preserve">(RQ1) On SWaT the detectors rank attacks equally well (AUROC 0.81–0.86, overlapping</w:t>
-      </w:r>
-      <w:r>
-        <w:t xml:space="preserve"> </w:t>
-      </w:r>
-      <w:r>
-        <w:t xml:space="preserve">intervals), and on WADI they do so once three drifting analysers are removed; on HAI</w:t>
+        <w:t xml:space="preserve">(RQ1) On SWaT all ten detectors reach AUROC 0.81–0.86 with overlapping intervals</w:t>
+      </w:r>
+      <w:r>
+        <w:t xml:space="preserve"> </w:t>
+      </w:r>
+      <w:r>
+        <w:t xml:space="preserve">(the top two not significantly different; equivalence of all ten not formally tested),</w:t>
+      </w:r>
+      <w:r>
+        <w:t xml:space="preserve"> </w:t>
+      </w:r>
+      <w:r>
+        <w:t xml:space="preserve">and on WADI they fall into a common band once three drifting analysers are removed; on HAI</w:t>
       </w:r>
       <w:r>
         <w:t xml:space="preserve"> </w:t>
@@ -9797,7 +9833,7 @@
       <w:r>
         <w:drawing>
           <wp:inline>
-            <wp:extent cx="6400800" cy="4405884"/>
+            <wp:extent cx="6400800" cy="4407619"/>
             <wp:effectExtent b="0" l="0" r="0" t="0"/>
             <wp:docPr descr="" title="" id="80" name="Picture"/>
             <a:graphic>
@@ -9818,7 +9854,7 @@
                   <pic:spPr bwMode="auto">
                     <a:xfrm>
                       <a:off x="0" y="0"/>
-                      <a:ext cx="6400800" cy="4405884"/>
+                      <a:ext cx="6400800" cy="4407619"/>
                     </a:xfrm>
                     <a:prstGeom prst="rect">
                       <a:avLst/>
@@ -13016,24 +13052,24 @@
                 <w:sz w:val="16"/>
                 <w:szCs w:val="16"/>
               </w:rPr>
-              <w:t xml:space="preserve">0.741 [0.588, 0.863]</w:t>
-            </w:r>
-          </w:p>
-        </w:tc>
-        <w:tc>
-          <w:tcPr/>
-          <w:p>
-            <w:pPr>
-              <w:pStyle w:val="Compact"/>
-              <w:keepNext/>
-              <w:jc w:val="center"/>
-            </w:pPr>
-            <w:r>
-              <w:rPr>
-                <w:sz w:val="16"/>
-                <w:szCs w:val="16"/>
-              </w:rPr>
-              <w:t xml:space="preserve">0.078</w:t>
+              <w:t xml:space="preserve">0.742 [0.588, 0.862]</w:t>
+            </w:r>
+          </w:p>
+        </w:tc>
+        <w:tc>
+          <w:tcPr/>
+          <w:p>
+            <w:pPr>
+              <w:pStyle w:val="Compact"/>
+              <w:keepNext/>
+              <w:jc w:val="center"/>
+            </w:pPr>
+            <w:r>
+              <w:rPr>
+                <w:sz w:val="16"/>
+                <w:szCs w:val="16"/>
+              </w:rPr>
+              <w:t xml:space="preserve">0.070</w:t>
             </w:r>
           </w:p>
         </w:tc>
@@ -13067,41 +13103,41 @@
                 <w:sz w:val="16"/>
                 <w:szCs w:val="16"/>
               </w:rPr>
-              <w:t xml:space="preserve">0.748 [0.599, 0.865]</w:t>
-            </w:r>
-          </w:p>
-        </w:tc>
-        <w:tc>
-          <w:tcPr/>
-          <w:p>
-            <w:pPr>
-              <w:pStyle w:val="Compact"/>
-              <w:keepNext/>
-              <w:jc w:val="center"/>
-            </w:pPr>
-            <w:r>
-              <w:rPr>
-                <w:sz w:val="16"/>
-                <w:szCs w:val="16"/>
-              </w:rPr>
-              <w:t xml:space="preserve">0.017</w:t>
-            </w:r>
-          </w:p>
-        </w:tc>
-        <w:tc>
-          <w:tcPr/>
-          <w:p>
-            <w:pPr>
-              <w:pStyle w:val="Compact"/>
-              <w:keepNext/>
-              <w:jc w:val="center"/>
-            </w:pPr>
-            <w:r>
-              <w:rPr>
-                <w:sz w:val="16"/>
-                <w:szCs w:val="16"/>
-              </w:rPr>
-              <w:t xml:space="preserve">0.013</w:t>
+              <w:t xml:space="preserve">0.748 [0.602, 0.864]</w:t>
+            </w:r>
+          </w:p>
+        </w:tc>
+        <w:tc>
+          <w:tcPr/>
+          <w:p>
+            <w:pPr>
+              <w:pStyle w:val="Compact"/>
+              <w:keepNext/>
+              <w:jc w:val="center"/>
+            </w:pPr>
+            <w:r>
+              <w:rPr>
+                <w:sz w:val="16"/>
+                <w:szCs w:val="16"/>
+              </w:rPr>
+              <w:t xml:space="preserve">0.022</w:t>
+            </w:r>
+          </w:p>
+        </w:tc>
+        <w:tc>
+          <w:tcPr/>
+          <w:p>
+            <w:pPr>
+              <w:pStyle w:val="Compact"/>
+              <w:keepNext/>
+              <w:jc w:val="center"/>
+            </w:pPr>
+            <w:r>
+              <w:rPr>
+                <w:sz w:val="16"/>
+                <w:szCs w:val="16"/>
+              </w:rPr>
+              <w:t xml:space="preserve">0.012</w:t>
             </w:r>
           </w:p>
         </w:tc>
@@ -13597,7 +13633,7 @@
                 <w:sz w:val="16"/>
                 <w:szCs w:val="16"/>
               </w:rPr>
-              <w:t xml:space="preserve">0.011</w:t>
+              <w:t xml:space="preserve">0.010</w:t>
             </w:r>
           </w:p>
         </w:tc>
@@ -13636,7 +13672,7 @@
                 <w:sz w:val="16"/>
                 <w:szCs w:val="16"/>
               </w:rPr>
-              <w:t xml:space="preserve">0.484 [0.337, 0.626]</w:t>
+              <w:t xml:space="preserve">0.484 [0.337, 0.625]</w:t>
             </w:r>
           </w:p>
         </w:tc>
@@ -13670,24 +13706,24 @@
                 <w:sz w:val="16"/>
                 <w:szCs w:val="16"/>
               </w:rPr>
-              <w:t xml:space="preserve">0.559</w:t>
-            </w:r>
-          </w:p>
-        </w:tc>
-        <w:tc>
-          <w:tcPr/>
-          <w:p>
-            <w:pPr>
-              <w:pStyle w:val="Compact"/>
-              <w:keepNext/>
-              <w:jc w:val="center"/>
-            </w:pPr>
-            <w:r>
-              <w:rPr>
-                <w:sz w:val="16"/>
-                <w:szCs w:val="16"/>
-              </w:rPr>
-              <w:t xml:space="preserve">0.650 [0.502, 0.763]</w:t>
+              <w:t xml:space="preserve">0.558</w:t>
+            </w:r>
+          </w:p>
+        </w:tc>
+        <w:tc>
+          <w:tcPr/>
+          <w:p>
+            <w:pPr>
+              <w:pStyle w:val="Compact"/>
+              <w:keepNext/>
+              <w:jc w:val="center"/>
+            </w:pPr>
+            <w:r>
+              <w:rPr>
+                <w:sz w:val="16"/>
+                <w:szCs w:val="16"/>
+              </w:rPr>
+              <w:t xml:space="preserve">0.649 [0.502, 0.762]</w:t>
             </w:r>
           </w:p>
         </w:tc>
@@ -13820,7 +13856,7 @@
                 <w:sz w:val="16"/>
                 <w:szCs w:val="16"/>
               </w:rPr>
-              <w:t xml:space="preserve">0.697 [0.575, 0.807]</w:t>
+              <w:t xml:space="preserve">0.697 [0.574, 0.807]</w:t>
             </w:r>
           </w:p>
         </w:tc>
@@ -13944,24 +13980,24 @@
                 <w:sz w:val="16"/>
                 <w:szCs w:val="16"/>
               </w:rPr>
-              <w:t xml:space="preserve">0.686 [0.480, 0.833]</w:t>
-            </w:r>
-          </w:p>
-        </w:tc>
-        <w:tc>
-          <w:tcPr/>
-          <w:p>
-            <w:pPr>
-              <w:pStyle w:val="Compact"/>
-              <w:keepNext/>
-              <w:jc w:val="center"/>
-            </w:pPr>
-            <w:r>
-              <w:rPr>
-                <w:sz w:val="16"/>
-                <w:szCs w:val="16"/>
-              </w:rPr>
-              <w:t xml:space="preserve">0.192</w:t>
+              <w:t xml:space="preserve">0.686 [0.479, 0.832]</w:t>
+            </w:r>
+          </w:p>
+        </w:tc>
+        <w:tc>
+          <w:tcPr/>
+          <w:p>
+            <w:pPr>
+              <w:pStyle w:val="Compact"/>
+              <w:keepNext/>
+              <w:jc w:val="center"/>
+            </w:pPr>
+            <w:r>
+              <w:rPr>
+                <w:sz w:val="16"/>
+                <w:szCs w:val="16"/>
+              </w:rPr>
+              <w:t xml:space="preserve">0.191</w:t>
             </w:r>
           </w:p>
         </w:tc>
@@ -14141,75 +14177,75 @@
                 <w:sz w:val="16"/>
                 <w:szCs w:val="16"/>
               </w:rPr>
-              <w:t xml:space="preserve">0.464 [0.295, 0.623]</w:t>
-            </w:r>
-          </w:p>
-        </w:tc>
-        <w:tc>
-          <w:tcPr/>
-          <w:p>
-            <w:pPr>
-              <w:pStyle w:val="Compact"/>
-              <w:keepNext/>
-              <w:jc w:val="center"/>
-            </w:pPr>
-            <w:r>
-              <w:rPr>
-                <w:sz w:val="16"/>
-                <w:szCs w:val="16"/>
-              </w:rPr>
-              <w:t xml:space="preserve">0.014</w:t>
-            </w:r>
-          </w:p>
-        </w:tc>
-        <w:tc>
-          <w:tcPr/>
-          <w:p>
-            <w:pPr>
-              <w:pStyle w:val="Compact"/>
-              <w:keepNext/>
-              <w:jc w:val="center"/>
-            </w:pPr>
-            <w:r>
-              <w:rPr>
-                <w:sz w:val="16"/>
-                <w:szCs w:val="16"/>
-              </w:rPr>
-              <w:t xml:space="preserve">0.561</w:t>
-            </w:r>
-          </w:p>
-        </w:tc>
-        <w:tc>
-          <w:tcPr/>
-          <w:p>
-            <w:pPr>
-              <w:pStyle w:val="Compact"/>
-              <w:keepNext/>
-              <w:jc w:val="center"/>
-            </w:pPr>
-            <w:r>
-              <w:rPr>
-                <w:sz w:val="16"/>
-                <w:szCs w:val="16"/>
-              </w:rPr>
-              <w:t xml:space="preserve">0.720 [0.494, 0.887]</w:t>
-            </w:r>
-          </w:p>
-        </w:tc>
-        <w:tc>
-          <w:tcPr/>
-          <w:p>
-            <w:pPr>
-              <w:pStyle w:val="Compact"/>
-              <w:keepNext/>
-              <w:jc w:val="center"/>
-            </w:pPr>
-            <w:r>
-              <w:rPr>
-                <w:sz w:val="16"/>
-                <w:szCs w:val="16"/>
-              </w:rPr>
-              <w:t xml:space="preserve">0.351</w:t>
+              <w:t xml:space="preserve">0.467 [0.296, 0.627]</w:t>
+            </w:r>
+          </w:p>
+        </w:tc>
+        <w:tc>
+          <w:tcPr/>
+          <w:p>
+            <w:pPr>
+              <w:pStyle w:val="Compact"/>
+              <w:keepNext/>
+              <w:jc w:val="center"/>
+            </w:pPr>
+            <w:r>
+              <w:rPr>
+                <w:sz w:val="16"/>
+                <w:szCs w:val="16"/>
+              </w:rPr>
+              <w:t xml:space="preserve">0.019</w:t>
+            </w:r>
+          </w:p>
+        </w:tc>
+        <w:tc>
+          <w:tcPr/>
+          <w:p>
+            <w:pPr>
+              <w:pStyle w:val="Compact"/>
+              <w:keepNext/>
+              <w:jc w:val="center"/>
+            </w:pPr>
+            <w:r>
+              <w:rPr>
+                <w:sz w:val="16"/>
+                <w:szCs w:val="16"/>
+              </w:rPr>
+              <w:t xml:space="preserve">0.560</w:t>
+            </w:r>
+          </w:p>
+        </w:tc>
+        <w:tc>
+          <w:tcPr/>
+          <w:p>
+            <w:pPr>
+              <w:pStyle w:val="Compact"/>
+              <w:keepNext/>
+              <w:jc w:val="center"/>
+            </w:pPr>
+            <w:r>
+              <w:rPr>
+                <w:sz w:val="16"/>
+                <w:szCs w:val="16"/>
+              </w:rPr>
+              <w:t xml:space="preserve">0.695 [0.471, 0.876]</w:t>
+            </w:r>
+          </w:p>
+        </w:tc>
+        <w:tc>
+          <w:tcPr/>
+          <w:p>
+            <w:pPr>
+              <w:pStyle w:val="Compact"/>
+              <w:keepNext/>
+              <w:jc w:val="center"/>
+            </w:pPr>
+            <w:r>
+              <w:rPr>
+                <w:sz w:val="16"/>
+                <w:szCs w:val="16"/>
+              </w:rPr>
+              <w:t xml:space="preserve">0.329</w:t>
             </w:r>
           </w:p>
         </w:tc>
@@ -14271,7 +14307,7 @@
       <w:r>
         <w:drawing>
           <wp:inline>
-            <wp:extent cx="6400800" cy="2277618"/>
+            <wp:extent cx="6400800" cy="2279707"/>
             <wp:effectExtent b="0" l="0" r="0" t="0"/>
             <wp:docPr descr="" title="" id="87" name="Picture"/>
             <a:graphic>
@@ -14292,7 +14328,7 @@
                   <pic:spPr bwMode="auto">
                     <a:xfrm>
                       <a:off x="0" y="0"/>
-                      <a:ext cx="6400800" cy="2277618"/>
+                      <a:ext cx="6400800" cy="2279707"/>
                     </a:xfrm>
                     <a:prstGeom prst="rect">
                       <a:avLst/>
@@ -17016,7 +17052,7 @@
       <w:r>
         <w:drawing>
           <wp:inline>
-            <wp:extent cx="6400800" cy="2128266"/>
+            <wp:extent cx="6400800" cy="2128234"/>
             <wp:effectExtent b="0" l="0" r="0" t="0"/>
             <wp:docPr descr="" title="" id="93" name="Picture"/>
             <a:graphic>
@@ -17037,7 +17073,7 @@
                   <pic:spPr bwMode="auto">
                     <a:xfrm>
                       <a:off x="0" y="0"/>
-                      <a:ext cx="6400800" cy="2128266"/>
+                      <a:ext cx="6400800" cy="2128234"/>
                     </a:xfrm>
                     <a:prstGeom prst="rect">
                       <a:avLst/>
@@ -19037,7 +19073,7 @@
       <w:r>
         <w:drawing>
           <wp:inline>
-            <wp:extent cx="4800600" cy="2782347"/>
+            <wp:extent cx="4800600" cy="2782307"/>
             <wp:effectExtent b="0" l="0" r="0" t="0"/>
             <wp:docPr descr="" title="" id="98" name="Picture"/>
             <a:graphic>
@@ -19058,7 +19094,7 @@
                   <pic:spPr bwMode="auto">
                     <a:xfrm>
                       <a:off x="0" y="0"/>
-                      <a:ext cx="4800600" cy="2782347"/>
+                      <a:ext cx="4800600" cy="2782307"/>
                     </a:xfrm>
                     <a:prstGeom prst="rect">
                       <a:avLst/>

</xml_diff>

<commit_message>
Detector-specific retraining claim; correct affiliation to LJKU Ahmedabad
Co-Authored-By: Claude Opus 5.5 <noreply@anthropic.com>
</commit_message>
<xml_diff>
--- a/paper/current/Shah_IJPHM_Protocol_Sensitivity_Industrial_Anomaly_Detection.docx
+++ b/paper/current/Shah_IJPHM_Protocol_Sensitivity_Industrial_Anomaly_Detection.docx
@@ -50,7 +50,7 @@
         <w:t xml:space="preserve">1</w:t>
       </w:r>
       <w:r>
-        <w:t xml:space="preserve">Department of Information Technology, Lok Jagruti University, Vadodara, Gujarat, India</w:t>
+        <w:t xml:space="preserve">Department of Information Technology, Lok Jagruti Kendra University, Ahmedabad, Gujarat, India</w:t>
       </w:r>
     </w:p>
     <w:p>
@@ -276,25 +276,37 @@
         <w:t xml:space="preserve"> </w:t>
       </w:r>
       <w:r>
-        <w:t xml:space="preserve">Forest’s false-alarm rate from 10% to 86%; retraining restored detection only when</w:t>
-      </w:r>
-      <w:r>
-        <w:t xml:space="preserve"> </w:t>
-      </w:r>
-      <w:r>
-        <w:t xml:space="preserve">retraining data were known to be normal; in this single stream, a drift trigger saved</w:t>
-      </w:r>
-      <w:r>
-        <w:t xml:space="preserve"> </w:t>
-      </w:r>
-      <w:r>
-        <w:t xml:space="preserve">some refits relative to a schedule but its checks cost more than refitting every hour; and</w:t>
-      </w:r>
-      <w:r>
-        <w:t xml:space="preserve"> </w:t>
-      </w:r>
-      <w:r>
-        <w:t xml:space="preserve">label-free retraining failed. Single-reading</w:t>
+        <w:t xml:space="preserve">Forest’s false-alarm rate from 10% to 86%. In this simulation, retraining improved</w:t>
+      </w:r>
+      <w:r>
+        <w:t xml:space="preserve"> </w:t>
+      </w:r>
+      <w:r>
+        <w:t xml:space="preserve">Isolation Forest when the retraining data were known to be normal, whereas label-free</w:t>
+      </w:r>
+      <w:r>
+        <w:t xml:space="preserve"> </w:t>
+      </w:r>
+      <w:r>
+        <w:t xml:space="preserve">selection made it collapse or absorb attacks into its normal model; Elliptic Envelope was</w:t>
+      </w:r>
+      <w:r>
+        <w:t xml:space="preserve"> </w:t>
+      </w:r>
+      <w:r>
+        <w:t xml:space="preserve">stable under predicted-normal selection, although frequent retraining on all recent rows</w:t>
+      </w:r>
+      <w:r>
+        <w:t xml:space="preserve"> </w:t>
+      </w:r>
+      <w:r>
+        <w:t xml:space="preserve">degraded it. A drift trigger saved some refits relative to a schedule, but its checks cost</w:t>
+      </w:r>
+      <w:r>
+        <w:t xml:space="preserve"> </w:t>
+      </w:r>
+      <w:r>
+        <w:t xml:space="preserve">more than refitting every hour. Single-reading</w:t>
       </w:r>
       <w:r>
         <w:t xml:space="preserve"> </w:t>
@@ -6591,25 +6603,37 @@
         <w:t xml:space="preserve"> </w:t>
       </w:r>
       <w:r>
-        <w:t xml:space="preserve">Forest and HBOS were the most dependable (MCC 0.46–0.63). (RQ3) Normal operation drifts enough to break a static Isolation</w:t>
-      </w:r>
-      <w:r>
-        <w:t xml:space="preserve"> </w:t>
-      </w:r>
-      <w:r>
-        <w:t xml:space="preserve">Forest; retraining restores it only when the retraining data are known to be</w:t>
-      </w:r>
-      <w:r>
-        <w:t xml:space="preserve"> </w:t>
-      </w:r>
-      <w:r>
-        <w:t xml:space="preserve">normal; in the single stream tested, drift-triggered retraining saved some refits but</w:t>
-      </w:r>
-      <w:r>
-        <w:t xml:space="preserve"> </w:t>
-      </w:r>
-      <w:r>
-        <w:t xml:space="preserve">cost more in drift checks than it saved; and label-free retraining failed. (RQ4) Single-reading costs range from</w:t>
+        <w:t xml:space="preserve">Forest and HBOS were the most dependable (MCC 0.46–0.63). (RQ3) In the single stream tested, normal operation drifts enough to break a static</w:t>
+      </w:r>
+      <w:r>
+        <w:t xml:space="preserve"> </w:t>
+      </w:r>
+      <w:r>
+        <w:t xml:space="preserve">Isolation Forest; retraining restores it only when the retraining data are known to be</w:t>
+      </w:r>
+      <w:r>
+        <w:t xml:space="preserve"> </w:t>
+      </w:r>
+      <w:r>
+        <w:t xml:space="preserve">normal, and label-free selection makes it collapse or absorb the attacks, whereas</w:t>
+      </w:r>
+      <w:r>
+        <w:t xml:space="preserve"> </w:t>
+      </w:r>
+      <w:r>
+        <w:t xml:space="preserve">Elliptic Envelope stays stable under predicted-normal selection and degrades only with</w:t>
+      </w:r>
+      <w:r>
+        <w:t xml:space="preserve"> </w:t>
+      </w:r>
+      <w:r>
+        <w:t xml:space="preserve">frequent all-rows retraining; drift-triggered retraining saved some refits but cost more</w:t>
+      </w:r>
+      <w:r>
+        <w:t xml:space="preserve"> </w:t>
+      </w:r>
+      <w:r>
+        <w:t xml:space="preserve">in drift checks than it saved. (RQ4) Single-reading costs range from</w:t>
       </w:r>
       <w:r>
         <w:t xml:space="preserve"> </w:t>

</xml_diff>

<commit_message>
Fifth review: SKAB paired-test wording, median/p99 latency, model-specific Table 9 retraining row
Co-Authored-By: Claude Opus 5.5 <noreply@anthropic.com>
</commit_message>
<xml_diff>
--- a/paper/current/Shah_IJPHM_Protocol_Sensitivity_Industrial_Anomaly_Detection.docx
+++ b/paper/current/Shah_IJPHM_Protocol_Sensitivity_Industrial_Anomaly_Detection.docx
@@ -172,7 +172,13 @@
         <w:t xml:space="preserve"> </w:t>
       </w:r>
       <w:r>
-        <w:t xml:space="preserve">0.575, CI 0.504–0.645) and none is distinguishable from the next best, while</w:t>
+        <w:t xml:space="preserve">0.575, CI 0.504–0.645) and the paired comparison of the two highest-scoring did</w:t>
+      </w:r>
+      <w:r>
+        <w:t xml:space="preserve"> </w:t>
+      </w:r>
+      <w:r>
+        <w:t xml:space="preserve">not establish a significant difference, while</w:t>
       </w:r>
       <w:r>
         <w:t xml:space="preserve"> </w:t>
@@ -312,7 +318,13 @@
         <w:t xml:space="preserve"> </w:t>
       </w:r>
       <w:r>
-        <w:t xml:space="preserve">cost in a one-CPU, 1 GB container ranged from microseconds to about 700 ms. The</w:t>
+        <w:t xml:space="preserve">latency in a one-CPU, 1 GB container ranged from microseconds to about 740 ms (median;</w:t>
+      </w:r>
+      <w:r>
+        <w:t xml:space="preserve"> </w:t>
+      </w:r>
+      <w:r>
+        <w:t xml:space="preserve">99th percentile up to 1.1 s for ECOD). The</w:t>
       </w:r>
       <w:r>
         <w:t xml:space="preserve"> </w:t>
@@ -738,7 +750,7 @@
         <w:t xml:space="preserve"> </w:t>
       </w:r>
       <w:r>
-        <w:t xml:space="preserve">that compares never, periodic, drift-triggered and continuous retraining, with</w:t>
+        <w:t xml:space="preserve">that compares never, periodic, drift-triggered and every-batch retraining, with</w:t>
       </w:r>
       <w:r>
         <w:t xml:space="preserve"> </w:t>
@@ -851,7 +863,7 @@
         <w:pStyle w:val="Definition"/>
       </w:pPr>
       <w:r>
-        <w:t xml:space="preserve">Does drift-triggered retraining outperform periodic or continuous</w:t>
+        <w:t xml:space="preserve">Does drift-triggered retraining outperform periodic or every-batch</w:t>
       </w:r>
       <w:r>
         <w:t xml:space="preserve"> </w:t>
@@ -6086,7 +6098,13 @@
         <w:t xml:space="preserve">z</w:t>
       </w:r>
       <w:r>
-        <w:t xml:space="preserve">-score) to about 700 ms (ECOD and COPOD in PyOD on SWaT, which store and</w:t>
+        <w:t xml:space="preserve">-score) to a median of 698–739 ms (99th percentile up to 1.1 s) for</w:t>
+      </w:r>
+      <w:r>
+        <w:t xml:space="preserve"> </w:t>
+      </w:r>
+      <w:r>
+        <w:t xml:space="preserve">ECOD and COPOD (in PyOD on SWaT, which store and</w:t>
       </w:r>
       <w:r>
         <w:t xml:space="preserve"> </w:t>
@@ -6541,7 +6559,13 @@
         <w:t xml:space="preserve"> </w:t>
       </w:r>
       <w:r>
-        <w:t xml:space="preserve">none is distinguishable from the next best. (RQ2) Protocol choices change the conclusions more than detector choice does:</w:t>
+        <w:t xml:space="preserve">the paired comparison of the two highest-scoring detectors did not establish a</w:t>
+      </w:r>
+      <w:r>
+        <w:t xml:space="preserve"> </w:t>
+      </w:r>
+      <w:r>
+        <w:t xml:space="preserve">significant difference. (RQ2) Protocol choices change the conclusions more than detector choice does:</w:t>
       </w:r>
       <w:r>
         <w:t xml:space="preserve"> </w:t>
@@ -6633,13 +6657,13 @@
         <w:t xml:space="preserve"> </w:t>
       </w:r>
       <w:r>
-        <w:t xml:space="preserve">in drift checks than it saved. (RQ4) Single-reading costs range from</w:t>
-      </w:r>
-      <w:r>
-        <w:t xml:space="preserve"> </w:t>
-      </w:r>
-      <w:r>
-        <w:t xml:space="preserve">microseconds to about 700 ms and model sizes from kilobytes to hundreds of megabytes</w:t>
+        <w:t xml:space="preserve">in drift checks than it saved. (RQ4) Median single-reading costs range from</w:t>
+      </w:r>
+      <w:r>
+        <w:t xml:space="preserve"> </w:t>
+      </w:r>
+      <w:r>
+        <w:t xml:space="preserve">microseconds to about 740 ms (99th percentile up to 1.1 s) and model sizes from kilobytes to hundreds of megabytes</w:t>
       </w:r>
       <w:r>
         <w:t xml:space="preserve"> </w:t>
@@ -19504,7 +19528,7 @@
                 <w:sz w:val="16"/>
                 <w:szCs w:val="16"/>
               </w:rPr>
-              <w:t xml:space="preserve">Oracle labels: Isolation Forest MCC 0.17 → 0.57. Predicted-normal: collapse to flag-everything. All rows: attacks absorbed, MCC ≤ 0.30</w:t>
+              <w:t xml:space="preserve">Isolation Forest: oracle labels MCC 0.17 → 0.57; predicted-normal: collapse to flag-everything (MCC ≤ 0.07); all rows: attacks absorbed (MCC ≤ 0.30). Elliptic Envelope: predicted-normal MCC 0.70–0.75; all rows 0.33–0.53 with 40 or more refits</w:t>
             </w:r>
           </w:p>
         </w:tc>

</xml_diff>

<commit_message>
Sixth review: APA reference order, complete reproduce commands
Co-Authored-By: Claude Opus 5.5 <noreply@anthropic.com>
</commit_message>
<xml_diff>
--- a/paper/current/Shah_IJPHM_Protocol_Sensitivity_Industrial_Anomaly_Detection.docx
+++ b/paper/current/Shah_IJPHM_Protocol_Sensitivity_Industrial_Anomaly_Detection.docx
@@ -7308,6 +7308,30 @@
         <w:pStyle w:val="phmreference"/>
       </w:pPr>
       <w:r>
+        <w:t xml:space="preserve">Liu, F. T., Ting, K. M., &amp; Zhou, Z.-H. (2008). Isolation forest. In</w:t>
+      </w:r>
+      <w:r>
+        <w:t xml:space="preserve"> </w:t>
+      </w:r>
+      <w:r>
+        <w:rPr>
+          <w:i/>
+          <w:iCs/>
+        </w:rPr>
+        <w:t xml:space="preserve">Proc. 8th IEEE Int. Conf. on Data Mining</w:t>
+      </w:r>
+      <w:r>
+        <w:t xml:space="preserve"> </w:t>
+      </w:r>
+      <w:r>
+        <w:t xml:space="preserve">(pp. 413–422). doi:10.1109/ICDM.2008.17</w:t>
+      </w:r>
+    </w:p>
+    <w:p>
+      <w:pPr>
+        <w:pStyle w:val="phmreference"/>
+      </w:pPr>
+      <w:r>
         <w:t xml:space="preserve">Liu, Q., &amp; Paparrizos, J. (2024). The elephant in the room: Towards a reliable time-series anomaly detection benchmark. In</w:t>
       </w:r>
       <w:r>
@@ -7325,30 +7349,6 @@
       </w:r>
       <w:r>
         <w:t xml:space="preserve">(pp. 108231–108261).</w:t>
-      </w:r>
-    </w:p>
-    <w:p>
-      <w:pPr>
-        <w:pStyle w:val="phmreference"/>
-      </w:pPr>
-      <w:r>
-        <w:t xml:space="preserve">Liu, F. T., Ting, K. M., &amp; Zhou, Z.-H. (2008). Isolation forest. In</w:t>
-      </w:r>
-      <w:r>
-        <w:t xml:space="preserve"> </w:t>
-      </w:r>
-      <w:r>
-        <w:rPr>
-          <w:i/>
-          <w:iCs/>
-        </w:rPr>
-        <w:t xml:space="preserve">Proc. 8th IEEE Int. Conf. on Data Mining</w:t>
-      </w:r>
-      <w:r>
-        <w:t xml:space="preserve"> </w:t>
-      </w:r>
-      <w:r>
-        <w:t xml:space="preserve">(pp. 413–422). doi:10.1109/ICDM.2008.17</w:t>
       </w:r>
     </w:p>
     <w:p>

</xml_diff>